<commit_message>
feat: Add 'Unit 1 Biology Mould' science unit content, including lessons, resources, and assessment materials, along with a docx-to-markdown conversion skill.
</commit_message>
<xml_diff>
--- a/Units/English/Year 2 ICP Lucas/Writing and creating texts task.docx
+++ b/Units/English/Year 2 ICP Lucas/Writing and creating texts task.docx
@@ -1,6 +1,6 @@
 
 <file path=word/document.xml><?xml version="1.0" encoding="utf-8"?>
-<w:document xmlns:wpc="http://schemas.microsoft.com/office/word/2010/wordprocessingCanvas" xmlns:cx="http://schemas.microsoft.com/office/drawing/2014/chartex" xmlns:cx1="http://schemas.microsoft.com/office/drawing/2015/9/8/chartex" xmlns:cx2="http://schemas.microsoft.com/office/drawing/2015/10/21/chartex" xmlns:cx3="http://schemas.microsoft.com/office/drawing/2016/5/9/chartex" xmlns:cx4="http://schemas.microsoft.com/office/drawing/2016/5/10/chartex" xmlns:cx5="http://schemas.microsoft.com/office/drawing/2016/5/11/chartex" xmlns:cx6="http://schemas.microsoft.com/office/drawing/2016/5/12/chartex" xmlns:cx7="http://schemas.microsoft.com/office/drawing/2016/5/13/chartex" xmlns:cx8="http://schemas.microsoft.com/office/drawing/2016/5/14/chartex" xmlns:mc="http://schemas.openxmlformats.org/markup-compatibility/2006" xmlns:aink="http://schemas.microsoft.com/office/drawing/2016/ink" xmlns:am3d="http://schemas.microsoft.com/office/drawing/2017/model3d" xmlns:o="urn:schemas-microsoft-com:office:office" xmlns:oel="http://schemas.microsoft.com/office/2019/extlst" xmlns:r="http://schemas.openxmlformats.org/officeDocument/2006/relationships" xmlns:m="http://schemas.openxmlformats.org/officeDocument/2006/math" xmlns:v="urn:schemas-microsoft-com:vml" xmlns:wp14="http://schemas.microsoft.com/office/word/2010/wordprocessingDrawing" xmlns:wp="http://schemas.openxmlformats.org/drawingml/2006/wordprocessingDrawing" xmlns:w10="urn:schemas-microsoft-com:office:word" xmlns:w="http://schemas.openxmlformats.org/wordprocessingml/2006/main" xmlns:w14="http://schemas.microsoft.com/office/word/2010/wordml" xmlns:w15="http://schemas.microsoft.com/office/word/2012/wordml" xmlns:w16cex="http://schemas.microsoft.com/office/word/2018/wordml/cex" xmlns:w16cid="http://schemas.microsoft.com/office/word/2016/wordml/cid" xmlns:w16="http://schemas.microsoft.com/office/word/2018/wordml" xmlns:w16sdtdh="http://schemas.microsoft.com/office/word/2020/wordml/sdtdatahash" xmlns:w16se="http://schemas.microsoft.com/office/word/2015/wordml/symex" xmlns:wpg="http://schemas.microsoft.com/office/word/2010/wordprocessingGroup" xmlns:wpi="http://schemas.microsoft.com/office/word/2010/wordprocessingInk" xmlns:wne="http://schemas.microsoft.com/office/word/2006/wordml" xmlns:wps="http://schemas.microsoft.com/office/word/2010/wordprocessingShape" mc:Ignorable="w14 w15 w16se w16cid w16 w16cex w16sdtdh wp14">
+<w:document xmlns:wpc="http://schemas.microsoft.com/office/word/2010/wordprocessingCanvas" xmlns:cx="http://schemas.microsoft.com/office/drawing/2014/chartex" xmlns:cx1="http://schemas.microsoft.com/office/drawing/2015/9/8/chartex" xmlns:cx2="http://schemas.microsoft.com/office/drawing/2015/10/21/chartex" xmlns:cx3="http://schemas.microsoft.com/office/drawing/2016/5/9/chartex" xmlns:cx4="http://schemas.microsoft.com/office/drawing/2016/5/10/chartex" xmlns:cx5="http://schemas.microsoft.com/office/drawing/2016/5/11/chartex" xmlns:cx6="http://schemas.microsoft.com/office/drawing/2016/5/12/chartex" xmlns:cx7="http://schemas.microsoft.com/office/drawing/2016/5/13/chartex" xmlns:cx8="http://schemas.microsoft.com/office/drawing/2016/5/14/chartex" xmlns:mc="http://schemas.openxmlformats.org/markup-compatibility/2006" xmlns:aink="http://schemas.microsoft.com/office/drawing/2016/ink" xmlns:am3d="http://schemas.microsoft.com/office/drawing/2017/model3d" xmlns:o="urn:schemas-microsoft-com:office:office" xmlns:oel="http://schemas.microsoft.com/office/2019/extlst" xmlns:r="http://schemas.openxmlformats.org/officeDocument/2006/relationships" xmlns:m="http://schemas.openxmlformats.org/officeDocument/2006/math" xmlns:v="urn:schemas-microsoft-com:vml" xmlns:wp14="http://schemas.microsoft.com/office/word/2010/wordprocessingDrawing" xmlns:wp="http://schemas.openxmlformats.org/drawingml/2006/wordprocessingDrawing" xmlns:w10="urn:schemas-microsoft-com:office:word" xmlns:w="http://schemas.openxmlformats.org/wordprocessingml/2006/main" xmlns:w14="http://schemas.microsoft.com/office/word/2010/wordml" xmlns:w15="http://schemas.microsoft.com/office/word/2012/wordml" xmlns:w16cex="http://schemas.microsoft.com/office/word/2018/wordml/cex" xmlns:w16cid="http://schemas.microsoft.com/office/word/2016/wordml/cid" xmlns:w16="http://schemas.microsoft.com/office/word/2018/wordml" xmlns:w16du="http://schemas.microsoft.com/office/word/2023/wordml/word16du" xmlns:w16sdtdh="http://schemas.microsoft.com/office/word/2020/wordml/sdtdatahash" xmlns:w16sdtfl="http://schemas.microsoft.com/office/word/2024/wordml/sdtformatlock" xmlns:w16se="http://schemas.microsoft.com/office/word/2015/wordml/symex" xmlns:wpg="http://schemas.microsoft.com/office/word/2010/wordprocessingGroup" xmlns:wpi="http://schemas.microsoft.com/office/word/2010/wordprocessingInk" xmlns:wne="http://schemas.microsoft.com/office/word/2006/wordml" xmlns:wps="http://schemas.microsoft.com/office/word/2010/wordprocessingShape" mc:Ignorable="w14 w15 w16se w16cid w16 w16cex w16sdtdh w16sdtfl w16du wp14">
   <w:body>
     <w:p>
       <w:pPr>
@@ -48,7 +48,7 @@
       <w:tblPr>
         <w:tblW w:w="10183" w:type="dxa"/>
         <w:tblBorders>
-          <w:left w:val="single" w:color="FFFFFF" w:sz="8" w:space="0"/>
+          <w:left w:val="single" w:sz="8" w:space="0" w:color="FFFFFF"/>
         </w:tblBorders>
         <w:tblLayout w:type="fixed"/>
         <w:tblCellMar>
@@ -71,11 +71,10 @@
             <w:tcW w:w="907" w:type="dxa"/>
             <w:tcBorders>
               <w:top w:val="nil"/>
-              <w:left w:val="single" w:color="FFFFFF" w:sz="18" w:space="0"/>
-              <w:bottom w:val="single" w:color="FFFFFF" w:sz="18" w:space="0"/>
-              <w:right w:val="single" w:color="FFFFFF" w:sz="18" w:space="0"/>
+              <w:left w:val="single" w:sz="18" w:space="0" w:color="FFFFFF"/>
+              <w:bottom w:val="single" w:sz="18" w:space="0" w:color="FFFFFF"/>
+              <w:right w:val="single" w:sz="18" w:space="0" w:color="FFFFFF"/>
             </w:tcBorders>
-            <w:shd w:val="clear" w:color="auto" w:fill="auto"/>
             <w:tcMar>
               <w:left w:w="28" w:type="dxa"/>
             </w:tcMar>
@@ -95,9 +94,9 @@
             <w:tcW w:w="6867" w:type="dxa"/>
             <w:tcBorders>
               <w:top w:val="nil"/>
-              <w:left w:val="single" w:color="FFFFFF" w:sz="18" w:space="0"/>
-              <w:bottom w:val="single" w:color="FFFFFF" w:sz="18" w:space="0"/>
-              <w:right w:val="single" w:color="FFFFFF" w:sz="18" w:space="0"/>
+              <w:left w:val="single" w:sz="18" w:space="0" w:color="FFFFFF"/>
+              <w:bottom w:val="single" w:sz="18" w:space="0" w:color="FFFFFF"/>
+              <w:right w:val="single" w:sz="18" w:space="0" w:color="FFFFFF"/>
             </w:tcBorders>
             <w:shd w:val="clear" w:color="auto" w:fill="EAEAEA"/>
           </w:tcPr>
@@ -112,11 +111,10 @@
             <w:tcW w:w="708" w:type="dxa"/>
             <w:tcBorders>
               <w:top w:val="nil"/>
-              <w:left w:val="single" w:color="FFFFFF" w:sz="18" w:space="0"/>
-              <w:bottom w:val="single" w:color="FFFFFF" w:sz="18" w:space="0"/>
-              <w:right w:val="single" w:color="FFFFFF" w:sz="18" w:space="0"/>
+              <w:left w:val="single" w:sz="18" w:space="0" w:color="FFFFFF"/>
+              <w:bottom w:val="single" w:sz="18" w:space="0" w:color="FFFFFF"/>
+              <w:right w:val="single" w:sz="18" w:space="0" w:color="FFFFFF"/>
             </w:tcBorders>
-            <w:shd w:val="clear" w:color="auto" w:fill="auto"/>
           </w:tcPr>
           <w:p>
             <w:pPr>
@@ -133,9 +131,9 @@
             <w:tcW w:w="1701" w:type="dxa"/>
             <w:tcBorders>
               <w:top w:val="nil"/>
-              <w:left w:val="single" w:color="FFFFFF" w:sz="18" w:space="0"/>
-              <w:bottom w:val="single" w:color="FFFFFF" w:sz="18" w:space="0"/>
-              <w:right w:val="single" w:color="FFFFFF" w:sz="18" w:space="0"/>
+              <w:left w:val="single" w:sz="18" w:space="0" w:color="FFFFFF"/>
+              <w:bottom w:val="single" w:sz="18" w:space="0" w:color="FFFFFF"/>
+              <w:right w:val="single" w:sz="18" w:space="0" w:color="FFFFFF"/>
             </w:tcBorders>
             <w:shd w:val="clear" w:color="auto" w:fill="EAEAEA"/>
           </w:tcPr>
@@ -151,12 +149,11 @@
           <w:tcPr>
             <w:tcW w:w="907" w:type="dxa"/>
             <w:tcBorders>
-              <w:top w:val="single" w:color="FFFFFF" w:sz="18" w:space="0"/>
-              <w:left w:val="single" w:color="FFFFFF" w:sz="18" w:space="0"/>
-              <w:bottom w:val="single" w:color="FFFFFF" w:sz="18" w:space="0"/>
-              <w:right w:val="single" w:color="FFFFFF" w:sz="18" w:space="0"/>
+              <w:top w:val="single" w:sz="18" w:space="0" w:color="FFFFFF"/>
+              <w:left w:val="single" w:sz="18" w:space="0" w:color="FFFFFF"/>
+              <w:bottom w:val="single" w:sz="18" w:space="0" w:color="FFFFFF"/>
+              <w:right w:val="single" w:sz="18" w:space="0" w:color="FFFFFF"/>
             </w:tcBorders>
-            <w:shd w:val="clear" w:color="auto" w:fill="auto"/>
             <w:tcMar>
               <w:left w:w="28" w:type="dxa"/>
             </w:tcMar>
@@ -175,10 +172,10 @@
           <w:tcPr>
             <w:tcW w:w="6867" w:type="dxa"/>
             <w:tcBorders>
-              <w:top w:val="single" w:color="FFFFFF" w:sz="18" w:space="0"/>
-              <w:left w:val="single" w:color="FFFFFF" w:sz="18" w:space="0"/>
-              <w:bottom w:val="single" w:color="FFFFFF" w:sz="18" w:space="0"/>
-              <w:right w:val="single" w:color="FFFFFF" w:sz="18" w:space="0"/>
+              <w:top w:val="single" w:sz="18" w:space="0" w:color="FFFFFF"/>
+              <w:left w:val="single" w:sz="18" w:space="0" w:color="FFFFFF"/>
+              <w:bottom w:val="single" w:sz="18" w:space="0" w:color="FFFFFF"/>
+              <w:right w:val="single" w:sz="18" w:space="0" w:color="FFFFFF"/>
             </w:tcBorders>
             <w:shd w:val="clear" w:color="auto" w:fill="EAEAEA"/>
           </w:tcPr>
@@ -192,12 +189,11 @@
           <w:tcPr>
             <w:tcW w:w="708" w:type="dxa"/>
             <w:tcBorders>
-              <w:top w:val="single" w:color="FFFFFF" w:sz="18" w:space="0"/>
-              <w:left w:val="single" w:color="FFFFFF" w:sz="18" w:space="0"/>
-              <w:bottom w:val="single" w:color="FFFFFF" w:sz="18" w:space="0"/>
-              <w:right w:val="single" w:color="FFFFFF" w:sz="18" w:space="0"/>
+              <w:top w:val="single" w:sz="18" w:space="0" w:color="FFFFFF"/>
+              <w:left w:val="single" w:sz="18" w:space="0" w:color="FFFFFF"/>
+              <w:bottom w:val="single" w:sz="18" w:space="0" w:color="FFFFFF"/>
+              <w:right w:val="single" w:sz="18" w:space="0" w:color="FFFFFF"/>
             </w:tcBorders>
-            <w:shd w:val="clear" w:color="auto" w:fill="auto"/>
           </w:tcPr>
           <w:p>
             <w:pPr>
@@ -213,10 +209,10 @@
           <w:tcPr>
             <w:tcW w:w="1701" w:type="dxa"/>
             <w:tcBorders>
-              <w:top w:val="single" w:color="FFFFFF" w:sz="18" w:space="0"/>
-              <w:left w:val="single" w:color="FFFFFF" w:sz="18" w:space="0"/>
-              <w:bottom w:val="single" w:color="FFFFFF" w:sz="18" w:space="0"/>
-              <w:right w:val="single" w:color="FFFFFF" w:sz="18" w:space="0"/>
+              <w:top w:val="single" w:sz="18" w:space="0" w:color="FFFFFF"/>
+              <w:left w:val="single" w:sz="18" w:space="0" w:color="FFFFFF"/>
+              <w:bottom w:val="single" w:sz="18" w:space="0" w:color="FFFFFF"/>
+              <w:right w:val="single" w:sz="18" w:space="0" w:color="FFFFFF"/>
             </w:tcBorders>
             <w:shd w:val="clear" w:color="auto" w:fill="EAEAEA"/>
           </w:tcPr>
@@ -520,13 +516,13 @@
       <w:pPr>
         <w:pStyle w:val="Body6-6space"/>
         <w:sectPr>
-          <w:headerReference w:type="even" r:id="rId9"/>
-          <w:headerReference w:type="default" r:id="rId10"/>
-          <w:footerReference w:type="even" r:id="rId11"/>
-          <w:footerReference w:type="default" r:id="rId12"/>
-          <w:headerReference w:type="first" r:id="rId13"/>
-          <w:footerReference w:type="first" r:id="rId14"/>
-          <w:pgSz w:w="11906" w:h="16838" w:orient="portrait" w:code="9"/>
+          <w:headerReference w:type="even" r:id="rId10"/>
+          <w:headerReference w:type="default" r:id="rId11"/>
+          <w:footerReference w:type="even" r:id="rId12"/>
+          <w:footerReference w:type="default" r:id="rId13"/>
+          <w:headerReference w:type="first" r:id="rId14"/>
+          <w:footerReference w:type="first" r:id="rId15"/>
+          <w:pgSz w:w="11906" w:h="16838" w:code="9"/>
           <w:pgMar w:top="851" w:right="851" w:bottom="1134" w:left="851" w:header="567" w:footer="454" w:gutter="0"/>
           <w:cols w:space="708"/>
           <w:docGrid w:linePitch="360"/>
@@ -616,12 +612,12 @@
       <w:tr>
         <w:tblPrEx>
           <w:tblBorders>
-            <w:top w:val="none" w:color="auto" w:sz="0" w:space="0"/>
-            <w:left w:val="none" w:color="auto" w:sz="0" w:space="0"/>
-            <w:bottom w:val="none" w:color="auto" w:sz="0" w:space="0"/>
-            <w:right w:val="none" w:color="auto" w:sz="0" w:space="0"/>
-            <w:insideH w:val="none" w:color="auto" w:sz="0" w:space="0"/>
-            <w:insideV w:val="none" w:color="auto" w:sz="0" w:space="0"/>
+            <w:top w:val="none" w:sz="0" w:space="0" w:color="auto"/>
+            <w:left w:val="none" w:sz="0" w:space="0" w:color="auto"/>
+            <w:bottom w:val="none" w:sz="0" w:space="0" w:color="auto"/>
+            <w:right w:val="none" w:sz="0" w:space="0" w:color="auto"/>
+            <w:insideH w:val="none" w:sz="0" w:space="0" w:color="auto"/>
+            <w:insideV w:val="none" w:sz="0" w:space="0" w:color="auto"/>
           </w:tblBorders>
           <w:shd w:val="clear" w:color="auto" w:fill="E7E6E6" w:themeFill="background2"/>
           <w:tblCellMar>
@@ -640,7 +636,6 @@
           <w:tcPr>
             <w:tcW w:w="10230" w:type="dxa"/>
             <w:gridSpan w:val="3"/>
-            <w:shd w:val="clear" w:color="auto" w:fill="auto"/>
             <w:tcMar>
               <w:top w:w="28" w:type="dxa"/>
               <w:bottom w:w="28" w:type="dxa"/>
@@ -650,7 +645,7 @@
             <w:pPr>
               <w:pStyle w:val="Footnote"/>
               <w:rPr>
-                <w:bdr w:val="none" w:color="auto" w:sz="0" w:space="0" w:frame="1"/>
+                <w:bdr w:val="none" w:sz="0" w:space="0" w:color="auto" w:frame="1"/>
               </w:rPr>
             </w:pPr>
           </w:p>
@@ -689,12 +684,12 @@
         <w:tblW w:w="15451" w:type="dxa"/>
         <w:tblInd w:w="-567" w:type="dxa"/>
         <w:tblBorders>
-          <w:top w:val="single" w:color="A6A6A6" w:themeColor="background1" w:themeShade="A6" w:sz="8" w:space="0"/>
-          <w:left w:val="single" w:color="A6A6A6" w:themeColor="background1" w:themeShade="A6" w:sz="8" w:space="0"/>
-          <w:bottom w:val="single" w:color="A6A6A6" w:themeColor="background1" w:themeShade="A6" w:sz="8" w:space="0"/>
-          <w:right w:val="single" w:color="A6A6A6" w:themeColor="background1" w:themeShade="A6" w:sz="8" w:space="0"/>
-          <w:insideH w:val="single" w:color="A6A6A6" w:themeColor="background1" w:themeShade="A6" w:sz="8" w:space="0"/>
-          <w:insideV w:val="single" w:color="A6A6A6" w:themeColor="background1" w:themeShade="A6" w:sz="8" w:space="0"/>
+          <w:top w:val="single" w:sz="8" w:space="0" w:color="A6A6A6" w:themeColor="background1" w:themeShade="A6"/>
+          <w:left w:val="single" w:sz="8" w:space="0" w:color="A6A6A6" w:themeColor="background1" w:themeShade="A6"/>
+          <w:bottom w:val="single" w:sz="8" w:space="0" w:color="A6A6A6" w:themeColor="background1" w:themeShade="A6"/>
+          <w:right w:val="single" w:sz="8" w:space="0" w:color="A6A6A6" w:themeColor="background1" w:themeShade="A6"/>
+          <w:insideH w:val="single" w:sz="8" w:space="0" w:color="A6A6A6" w:themeColor="background1" w:themeShade="A6"/>
+          <w:insideV w:val="single" w:sz="8" w:space="0" w:color="A6A6A6" w:themeColor="background1" w:themeShade="A6"/>
         </w:tblBorders>
         <w:tblCellMar>
           <w:top w:w="85" w:type="dxa"/>
@@ -982,7 +977,6 @@
           <w:tcPr>
             <w:tcW w:w="3756" w:type="dxa"/>
             <w:gridSpan w:val="2"/>
-            <w:shd w:val="clear" w:color="auto" w:fill="auto"/>
             <w:vAlign w:val="center"/>
           </w:tcPr>
           <w:p>
@@ -1006,7 +1000,6 @@
         <w:tc>
           <w:tcPr>
             <w:tcW w:w="3899" w:type="dxa"/>
-            <w:shd w:val="clear" w:color="auto" w:fill="auto"/>
             <w:vAlign w:val="center"/>
           </w:tcPr>
           <w:p>
@@ -1029,7 +1022,6 @@
           <w:tcPr>
             <w:tcW w:w="3614" w:type="dxa"/>
             <w:gridSpan w:val="3"/>
-            <w:shd w:val="clear" w:color="auto" w:fill="auto"/>
             <w:vAlign w:val="center"/>
           </w:tcPr>
           <w:p>
@@ -1065,7 +1057,6 @@
           <w:tcPr>
             <w:tcW w:w="3757" w:type="dxa"/>
             <w:gridSpan w:val="2"/>
-            <w:shd w:val="clear" w:color="auto" w:fill="auto"/>
             <w:vAlign w:val="center"/>
           </w:tcPr>
           <w:p>
@@ -1165,7 +1156,6 @@
           <w:tcPr>
             <w:tcW w:w="3756" w:type="dxa"/>
             <w:gridSpan w:val="2"/>
-            <w:shd w:val="clear" w:color="auto" w:fill="auto"/>
             <w:vAlign w:val="center"/>
           </w:tcPr>
           <w:p>
@@ -1189,7 +1179,6 @@
         <w:tc>
           <w:tcPr>
             <w:tcW w:w="3899" w:type="dxa"/>
-            <w:shd w:val="clear" w:color="auto" w:fill="auto"/>
             <w:vAlign w:val="center"/>
           </w:tcPr>
           <w:p>
@@ -1221,7 +1210,6 @@
           <w:tcPr>
             <w:tcW w:w="3614" w:type="dxa"/>
             <w:gridSpan w:val="3"/>
-            <w:shd w:val="clear" w:color="auto" w:fill="auto"/>
             <w:vAlign w:val="center"/>
           </w:tcPr>
           <w:p>
@@ -1253,7 +1241,6 @@
           <w:tcPr>
             <w:tcW w:w="3757" w:type="dxa"/>
             <w:gridSpan w:val="2"/>
-            <w:shd w:val="clear" w:color="auto" w:fill="auto"/>
             <w:vAlign w:val="center"/>
           </w:tcPr>
           <w:p>
@@ -1318,7 +1305,6 @@
           <w:tcPr>
             <w:tcW w:w="3756" w:type="dxa"/>
             <w:gridSpan w:val="2"/>
-            <w:shd w:val="clear" w:color="auto" w:fill="auto"/>
             <w:vAlign w:val="center"/>
           </w:tcPr>
           <w:p>
@@ -1334,7 +1320,6 @@
         <w:tc>
           <w:tcPr>
             <w:tcW w:w="3899" w:type="dxa"/>
-            <w:shd w:val="clear" w:color="auto" w:fill="auto"/>
             <w:vAlign w:val="center"/>
           </w:tcPr>
           <w:p>
@@ -1351,7 +1336,6 @@
           <w:tcPr>
             <w:tcW w:w="3614" w:type="dxa"/>
             <w:gridSpan w:val="3"/>
-            <w:shd w:val="clear" w:color="auto" w:fill="auto"/>
             <w:vAlign w:val="center"/>
           </w:tcPr>
           <w:p>
@@ -1368,7 +1352,6 @@
           <w:tcPr>
             <w:tcW w:w="3757" w:type="dxa"/>
             <w:gridSpan w:val="2"/>
-            <w:shd w:val="clear" w:color="auto" w:fill="auto"/>
             <w:vAlign w:val="center"/>
           </w:tcPr>
           <w:p>
@@ -1431,9 +1414,8 @@
             <w:tcW w:w="3756" w:type="dxa"/>
             <w:gridSpan w:val="2"/>
             <w:tcBorders>
-              <w:bottom w:val="single" w:color="A6A6A6" w:themeColor="background1" w:themeShade="A6" w:sz="8" w:space="0"/>
+              <w:bottom w:val="single" w:sz="8" w:space="0" w:color="A6A6A6" w:themeColor="background1" w:themeShade="A6"/>
             </w:tcBorders>
-            <w:shd w:val="clear" w:color="auto" w:fill="auto"/>
             <w:vAlign w:val="center"/>
           </w:tcPr>
           <w:p>
@@ -1453,9 +1435,8 @@
           <w:tcPr>
             <w:tcW w:w="3899" w:type="dxa"/>
             <w:tcBorders>
-              <w:bottom w:val="single" w:color="A6A6A6" w:themeColor="background1" w:themeShade="A6" w:sz="8" w:space="0"/>
+              <w:bottom w:val="single" w:sz="8" w:space="0" w:color="A6A6A6" w:themeColor="background1" w:themeShade="A6"/>
             </w:tcBorders>
-            <w:shd w:val="clear" w:color="auto" w:fill="auto"/>
             <w:vAlign w:val="center"/>
           </w:tcPr>
           <w:p>
@@ -1476,23 +1457,16 @@
             <w:tcW w:w="3614" w:type="dxa"/>
             <w:gridSpan w:val="3"/>
             <w:tcBorders>
-              <w:bottom w:val="single" w:color="A6A6A6" w:themeColor="background1" w:themeShade="A6" w:sz="8" w:space="0"/>
+              <w:bottom w:val="single" w:sz="8" w:space="0" w:color="A6A6A6" w:themeColor="background1" w:themeShade="A6"/>
             </w:tcBorders>
-            <w:shd w:val="clear" w:color="auto" w:fill="auto"/>
             <w:vAlign w:val="center"/>
           </w:tcPr>
           <w:p>
             <w:pPr>
               <w:pStyle w:val="Table-9ptBody0-6space"/>
               <w:spacing w:after="60"/>
-              <w:rPr>
-                <w:highlight w:val="yellow"/>
-              </w:rPr>
-            </w:pPr>
-            <w:r>
-              <w:rPr>
-                <w:highlight w:val="yellow"/>
-              </w:rPr>
+            </w:pPr>
+            <w:r>
               <w:t>Punctuates simple sentences.</w:t>
             </w:r>
           </w:p>
@@ -1502,9 +1476,8 @@
             <w:tcW w:w="3757" w:type="dxa"/>
             <w:gridSpan w:val="2"/>
             <w:tcBorders>
-              <w:bottom w:val="single" w:color="A6A6A6" w:themeColor="background1" w:themeShade="A6" w:sz="8" w:space="0"/>
+              <w:bottom w:val="single" w:sz="8" w:space="0" w:color="A6A6A6" w:themeColor="background1" w:themeShade="A6"/>
             </w:tcBorders>
-            <w:shd w:val="clear" w:color="auto" w:fill="auto"/>
             <w:vAlign w:val="center"/>
           </w:tcPr>
           <w:p>
@@ -1513,10 +1486,7 @@
               <w:spacing w:after="60"/>
             </w:pPr>
             <w:r>
-              <w:t xml:space="preserve"> </w:t>
-            </w:r>
-            <w:r>
-              <w:t>experiments with topic-specific vocabulary</w:t>
+              <w:t xml:space="preserve"> experiments with topic-specific vocabulary</w:t>
             </w:r>
           </w:p>
         </w:tc>
@@ -1569,7 +1539,6 @@
           <w:tcPr>
             <w:tcW w:w="3756" w:type="dxa"/>
             <w:gridSpan w:val="2"/>
-            <w:shd w:val="clear" w:color="auto" w:fill="auto"/>
             <w:vAlign w:val="center"/>
           </w:tcPr>
           <w:p>
@@ -1591,7 +1560,6 @@
         <w:tc>
           <w:tcPr>
             <w:tcW w:w="3899" w:type="dxa"/>
-            <w:shd w:val="clear" w:color="auto" w:fill="auto"/>
             <w:vAlign w:val="center"/>
           </w:tcPr>
           <w:p>
@@ -1611,7 +1579,6 @@
           <w:tcPr>
             <w:tcW w:w="3614" w:type="dxa"/>
             <w:gridSpan w:val="3"/>
-            <w:shd w:val="clear" w:color="auto" w:fill="auto"/>
             <w:vAlign w:val="center"/>
           </w:tcPr>
           <w:p>
@@ -1620,13 +1587,7 @@
               <w:spacing w:after="60"/>
             </w:pPr>
             <w:r>
-              <w:rPr>
-                <w:highlight w:val="yellow"/>
-              </w:rPr>
-              <w:t>Experiments with boundary punctuation</w:t>
-            </w:r>
-            <w:r>
-              <w:t>.</w:t>
+              <w:t>Experiments with boundary punctuation.</w:t>
             </w:r>
           </w:p>
         </w:tc>
@@ -1634,21 +1595,14 @@
           <w:tcPr>
             <w:tcW w:w="3757" w:type="dxa"/>
             <w:gridSpan w:val="2"/>
-            <w:shd w:val="clear" w:color="auto" w:fill="auto"/>
             <w:vAlign w:val="center"/>
           </w:tcPr>
           <w:p>
             <w:pPr>
               <w:pStyle w:val="Table-9ptBody0-6space"/>
               <w:spacing w:after="60"/>
-              <w:rPr>
-                <w:highlight w:val="yellow"/>
-              </w:rPr>
-            </w:pPr>
-            <w:r>
-              <w:rPr>
-                <w:highlight w:val="yellow"/>
-              </w:rPr>
+            </w:pPr>
+            <w:r>
               <w:t xml:space="preserve"> familiar vocabulary.</w:t>
             </w:r>
           </w:p>
@@ -1712,7 +1666,7 @@
             <w:tcW w:w="7922" w:type="dxa"/>
             <w:gridSpan w:val="3"/>
             <w:tcBorders>
-              <w:bottom w:val="single" w:color="A6A6A6" w:themeColor="background1" w:themeShade="A6" w:sz="8" w:space="0"/>
+              <w:bottom w:val="single" w:sz="8" w:space="0" w:color="A6A6A6" w:themeColor="background1" w:themeShade="A6"/>
             </w:tcBorders>
             <w:shd w:val="clear" w:color="auto" w:fill="006600"/>
             <w:tcMar>
@@ -1905,7 +1859,15 @@
               <w:pStyle w:val="Table-9ptBody0-0space"/>
             </w:pPr>
             <w:r>
-              <w:t>Spells words with regular spelling patterns, and use</w:t>
+              <w:t xml:space="preserve">Spells words with regular spelling </w:t>
+            </w:r>
+            <w:proofErr w:type="gramStart"/>
+            <w:r>
+              <w:t>patterns, and</w:t>
+            </w:r>
+            <w:proofErr w:type="gramEnd"/>
+            <w:r>
+              <w:t xml:space="preserve"> use</w:t>
             </w:r>
             <w:r>
               <w:t>s</w:t>
@@ -1965,7 +1927,7 @@
 </file>
 
 <file path=word/endnotes.xml><?xml version="1.0" encoding="utf-8"?>
-<w:endnotes xmlns:wpc="http://schemas.microsoft.com/office/word/2010/wordprocessingCanvas" xmlns:cx="http://schemas.microsoft.com/office/drawing/2014/chartex" xmlns:cx1="http://schemas.microsoft.com/office/drawing/2015/9/8/chartex" xmlns:cx2="http://schemas.microsoft.com/office/drawing/2015/10/21/chartex" xmlns:cx3="http://schemas.microsoft.com/office/drawing/2016/5/9/chartex" xmlns:cx4="http://schemas.microsoft.com/office/drawing/2016/5/10/chartex" xmlns:cx5="http://schemas.microsoft.com/office/drawing/2016/5/11/chartex" xmlns:cx6="http://schemas.microsoft.com/office/drawing/2016/5/12/chartex" xmlns:cx7="http://schemas.microsoft.com/office/drawing/2016/5/13/chartex" xmlns:cx8="http://schemas.microsoft.com/office/drawing/2016/5/14/chartex" xmlns:mc="http://schemas.openxmlformats.org/markup-compatibility/2006" xmlns:aink="http://schemas.microsoft.com/office/drawing/2016/ink" xmlns:am3d="http://schemas.microsoft.com/office/drawing/2017/model3d" xmlns:o="urn:schemas-microsoft-com:office:office" xmlns:oel="http://schemas.microsoft.com/office/2019/extlst" xmlns:r="http://schemas.openxmlformats.org/officeDocument/2006/relationships" xmlns:m="http://schemas.openxmlformats.org/officeDocument/2006/math" xmlns:v="urn:schemas-microsoft-com:vml" xmlns:wp14="http://schemas.microsoft.com/office/word/2010/wordprocessingDrawing" xmlns:wp="http://schemas.openxmlformats.org/drawingml/2006/wordprocessingDrawing" xmlns:w10="urn:schemas-microsoft-com:office:word" xmlns:w="http://schemas.openxmlformats.org/wordprocessingml/2006/main" xmlns:w14="http://schemas.microsoft.com/office/word/2010/wordml" xmlns:w15="http://schemas.microsoft.com/office/word/2012/wordml" xmlns:w16cex="http://schemas.microsoft.com/office/word/2018/wordml/cex" xmlns:w16cid="http://schemas.microsoft.com/office/word/2016/wordml/cid" xmlns:w16="http://schemas.microsoft.com/office/word/2018/wordml" xmlns:w16sdtdh="http://schemas.microsoft.com/office/word/2020/wordml/sdtdatahash" xmlns:w16se="http://schemas.microsoft.com/office/word/2015/wordml/symex" xmlns:wpg="http://schemas.microsoft.com/office/word/2010/wordprocessingGroup" xmlns:wpi="http://schemas.microsoft.com/office/word/2010/wordprocessingInk" xmlns:wne="http://schemas.microsoft.com/office/word/2006/wordml" xmlns:wps="http://schemas.microsoft.com/office/word/2010/wordprocessingShape" mc:Ignorable="w14 w15 w16se w16cid w16 w16cex w16sdtdh wp14">
+<w:endnotes xmlns:wpc="http://schemas.microsoft.com/office/word/2010/wordprocessingCanvas" xmlns:cx="http://schemas.microsoft.com/office/drawing/2014/chartex" xmlns:cx1="http://schemas.microsoft.com/office/drawing/2015/9/8/chartex" xmlns:cx2="http://schemas.microsoft.com/office/drawing/2015/10/21/chartex" xmlns:cx3="http://schemas.microsoft.com/office/drawing/2016/5/9/chartex" xmlns:cx4="http://schemas.microsoft.com/office/drawing/2016/5/10/chartex" xmlns:cx5="http://schemas.microsoft.com/office/drawing/2016/5/11/chartex" xmlns:cx6="http://schemas.microsoft.com/office/drawing/2016/5/12/chartex" xmlns:cx7="http://schemas.microsoft.com/office/drawing/2016/5/13/chartex" xmlns:cx8="http://schemas.microsoft.com/office/drawing/2016/5/14/chartex" xmlns:mc="http://schemas.openxmlformats.org/markup-compatibility/2006" xmlns:aink="http://schemas.microsoft.com/office/drawing/2016/ink" xmlns:am3d="http://schemas.microsoft.com/office/drawing/2017/model3d" xmlns:o="urn:schemas-microsoft-com:office:office" xmlns:oel="http://schemas.microsoft.com/office/2019/extlst" xmlns:r="http://schemas.openxmlformats.org/officeDocument/2006/relationships" xmlns:m="http://schemas.openxmlformats.org/officeDocument/2006/math" xmlns:v="urn:schemas-microsoft-com:vml" xmlns:wp14="http://schemas.microsoft.com/office/word/2010/wordprocessingDrawing" xmlns:wp="http://schemas.openxmlformats.org/drawingml/2006/wordprocessingDrawing" xmlns:w10="urn:schemas-microsoft-com:office:word" xmlns:w="http://schemas.openxmlformats.org/wordprocessingml/2006/main" xmlns:w14="http://schemas.microsoft.com/office/word/2010/wordml" xmlns:w15="http://schemas.microsoft.com/office/word/2012/wordml" xmlns:w16cex="http://schemas.microsoft.com/office/word/2018/wordml/cex" xmlns:w16cid="http://schemas.microsoft.com/office/word/2016/wordml/cid" xmlns:w16="http://schemas.microsoft.com/office/word/2018/wordml" xmlns:w16du="http://schemas.microsoft.com/office/word/2023/wordml/word16du" xmlns:w16sdtdh="http://schemas.microsoft.com/office/word/2020/wordml/sdtdatahash" xmlns:w16sdtfl="http://schemas.microsoft.com/office/word/2024/wordml/sdtformatlock" xmlns:w16se="http://schemas.microsoft.com/office/word/2015/wordml/symex" xmlns:wpg="http://schemas.microsoft.com/office/word/2010/wordprocessingGroup" xmlns:wpi="http://schemas.microsoft.com/office/word/2010/wordprocessingInk" xmlns:wne="http://schemas.microsoft.com/office/word/2006/wordml" xmlns:wps="http://schemas.microsoft.com/office/word/2010/wordprocessingShape" mc:Ignorable="w14 w15 w16se w16cid w16 w16cex w16sdtdh w16sdtfl w16du wp14">
   <w:endnote w:type="separator" w:id="-1">
     <w:p>
       <w:pPr>
@@ -1990,7 +1952,7 @@
 </file>
 
 <file path=word/footer1.xml><?xml version="1.0" encoding="utf-8"?>
-<w:ftr xmlns:wpc="http://schemas.microsoft.com/office/word/2010/wordprocessingCanvas" xmlns:cx="http://schemas.microsoft.com/office/drawing/2014/chartex" xmlns:cx1="http://schemas.microsoft.com/office/drawing/2015/9/8/chartex" xmlns:cx2="http://schemas.microsoft.com/office/drawing/2015/10/21/chartex" xmlns:cx3="http://schemas.microsoft.com/office/drawing/2016/5/9/chartex" xmlns:cx4="http://schemas.microsoft.com/office/drawing/2016/5/10/chartex" xmlns:cx5="http://schemas.microsoft.com/office/drawing/2016/5/11/chartex" xmlns:cx6="http://schemas.microsoft.com/office/drawing/2016/5/12/chartex" xmlns:cx7="http://schemas.microsoft.com/office/drawing/2016/5/13/chartex" xmlns:cx8="http://schemas.microsoft.com/office/drawing/2016/5/14/chartex" xmlns:mc="http://schemas.openxmlformats.org/markup-compatibility/2006" xmlns:aink="http://schemas.microsoft.com/office/drawing/2016/ink" xmlns:am3d="http://schemas.microsoft.com/office/drawing/2017/model3d" xmlns:o="urn:schemas-microsoft-com:office:office" xmlns:oel="http://schemas.microsoft.com/office/2019/extlst" xmlns:r="http://schemas.openxmlformats.org/officeDocument/2006/relationships" xmlns:m="http://schemas.openxmlformats.org/officeDocument/2006/math" xmlns:v="urn:schemas-microsoft-com:vml" xmlns:wp14="http://schemas.microsoft.com/office/word/2010/wordprocessingDrawing" xmlns:wp="http://schemas.openxmlformats.org/drawingml/2006/wordprocessingDrawing" xmlns:w10="urn:schemas-microsoft-com:office:word" xmlns:w="http://schemas.openxmlformats.org/wordprocessingml/2006/main" xmlns:w14="http://schemas.microsoft.com/office/word/2010/wordml" xmlns:w15="http://schemas.microsoft.com/office/word/2012/wordml" xmlns:w16cex="http://schemas.microsoft.com/office/word/2018/wordml/cex" xmlns:w16cid="http://schemas.microsoft.com/office/word/2016/wordml/cid" xmlns:w16="http://schemas.microsoft.com/office/word/2018/wordml" xmlns:w16sdtdh="http://schemas.microsoft.com/office/word/2020/wordml/sdtdatahash" xmlns:w16se="http://schemas.microsoft.com/office/word/2015/wordml/symex" xmlns:wpg="http://schemas.microsoft.com/office/word/2010/wordprocessingGroup" xmlns:wpi="http://schemas.microsoft.com/office/word/2010/wordprocessingInk" xmlns:wne="http://schemas.microsoft.com/office/word/2006/wordml" xmlns:wps="http://schemas.microsoft.com/office/word/2010/wordprocessingShape" mc:Ignorable="w14 w15 w16se w16cid w16 w16cex w16sdtdh wp14">
+<w:ftr xmlns:wpc="http://schemas.microsoft.com/office/word/2010/wordprocessingCanvas" xmlns:cx="http://schemas.microsoft.com/office/drawing/2014/chartex" xmlns:cx1="http://schemas.microsoft.com/office/drawing/2015/9/8/chartex" xmlns:cx2="http://schemas.microsoft.com/office/drawing/2015/10/21/chartex" xmlns:cx3="http://schemas.microsoft.com/office/drawing/2016/5/9/chartex" xmlns:cx4="http://schemas.microsoft.com/office/drawing/2016/5/10/chartex" xmlns:cx5="http://schemas.microsoft.com/office/drawing/2016/5/11/chartex" xmlns:cx6="http://schemas.microsoft.com/office/drawing/2016/5/12/chartex" xmlns:cx7="http://schemas.microsoft.com/office/drawing/2016/5/13/chartex" xmlns:cx8="http://schemas.microsoft.com/office/drawing/2016/5/14/chartex" xmlns:mc="http://schemas.openxmlformats.org/markup-compatibility/2006" xmlns:aink="http://schemas.microsoft.com/office/drawing/2016/ink" xmlns:am3d="http://schemas.microsoft.com/office/drawing/2017/model3d" xmlns:o="urn:schemas-microsoft-com:office:office" xmlns:oel="http://schemas.microsoft.com/office/2019/extlst" xmlns:r="http://schemas.openxmlformats.org/officeDocument/2006/relationships" xmlns:m="http://schemas.openxmlformats.org/officeDocument/2006/math" xmlns:v="urn:schemas-microsoft-com:vml" xmlns:wp14="http://schemas.microsoft.com/office/word/2010/wordprocessingDrawing" xmlns:wp="http://schemas.openxmlformats.org/drawingml/2006/wordprocessingDrawing" xmlns:w10="urn:schemas-microsoft-com:office:word" xmlns:w="http://schemas.openxmlformats.org/wordprocessingml/2006/main" xmlns:w14="http://schemas.microsoft.com/office/word/2010/wordml" xmlns:w15="http://schemas.microsoft.com/office/word/2012/wordml" xmlns:w16cex="http://schemas.microsoft.com/office/word/2018/wordml/cex" xmlns:w16cid="http://schemas.microsoft.com/office/word/2016/wordml/cid" xmlns:w16="http://schemas.microsoft.com/office/word/2018/wordml" xmlns:w16du="http://schemas.microsoft.com/office/word/2023/wordml/word16du" xmlns:w16sdtdh="http://schemas.microsoft.com/office/word/2020/wordml/sdtdatahash" xmlns:w16sdtfl="http://schemas.microsoft.com/office/word/2024/wordml/sdtformatlock" xmlns:w16se="http://schemas.microsoft.com/office/word/2015/wordml/symex" xmlns:wpg="http://schemas.microsoft.com/office/word/2010/wordprocessingGroup" xmlns:wpi="http://schemas.microsoft.com/office/word/2010/wordprocessingInk" xmlns:wne="http://schemas.microsoft.com/office/word/2006/wordml" xmlns:wps="http://schemas.microsoft.com/office/word/2010/wordprocessingShape" mc:Ignorable="w14 w15 w16se w16cid w16 w16cex w16sdtdh w16sdtfl w16du wp14">
   <w:p>
     <w:pPr>
       <w:pStyle w:val="Footer"/>
@@ -2000,7 +1962,7 @@
 </file>
 
 <file path=word/footer2.xml><?xml version="1.0" encoding="utf-8"?>
-<w:ftr xmlns:wpc="http://schemas.microsoft.com/office/word/2010/wordprocessingCanvas" xmlns:cx="http://schemas.microsoft.com/office/drawing/2014/chartex" xmlns:cx1="http://schemas.microsoft.com/office/drawing/2015/9/8/chartex" xmlns:cx2="http://schemas.microsoft.com/office/drawing/2015/10/21/chartex" xmlns:cx3="http://schemas.microsoft.com/office/drawing/2016/5/9/chartex" xmlns:cx4="http://schemas.microsoft.com/office/drawing/2016/5/10/chartex" xmlns:cx5="http://schemas.microsoft.com/office/drawing/2016/5/11/chartex" xmlns:cx6="http://schemas.microsoft.com/office/drawing/2016/5/12/chartex" xmlns:cx7="http://schemas.microsoft.com/office/drawing/2016/5/13/chartex" xmlns:cx8="http://schemas.microsoft.com/office/drawing/2016/5/14/chartex" xmlns:mc="http://schemas.openxmlformats.org/markup-compatibility/2006" xmlns:aink="http://schemas.microsoft.com/office/drawing/2016/ink" xmlns:am3d="http://schemas.microsoft.com/office/drawing/2017/model3d" xmlns:o="urn:schemas-microsoft-com:office:office" xmlns:oel="http://schemas.microsoft.com/office/2019/extlst" xmlns:r="http://schemas.openxmlformats.org/officeDocument/2006/relationships" xmlns:m="http://schemas.openxmlformats.org/officeDocument/2006/math" xmlns:v="urn:schemas-microsoft-com:vml" xmlns:wp14="http://schemas.microsoft.com/office/word/2010/wordprocessingDrawing" xmlns:wp="http://schemas.openxmlformats.org/drawingml/2006/wordprocessingDrawing" xmlns:w10="urn:schemas-microsoft-com:office:word" xmlns:w="http://schemas.openxmlformats.org/wordprocessingml/2006/main" xmlns:w14="http://schemas.microsoft.com/office/word/2010/wordml" xmlns:w15="http://schemas.microsoft.com/office/word/2012/wordml" xmlns:w16cex="http://schemas.microsoft.com/office/word/2018/wordml/cex" xmlns:w16cid="http://schemas.microsoft.com/office/word/2016/wordml/cid" xmlns:w16="http://schemas.microsoft.com/office/word/2018/wordml" xmlns:w16sdtdh="http://schemas.microsoft.com/office/word/2020/wordml/sdtdatahash" xmlns:w16se="http://schemas.microsoft.com/office/word/2015/wordml/symex" xmlns:wpg="http://schemas.microsoft.com/office/word/2010/wordprocessingGroup" xmlns:wpi="http://schemas.microsoft.com/office/word/2010/wordprocessingInk" xmlns:wne="http://schemas.microsoft.com/office/word/2006/wordml" xmlns:wps="http://schemas.microsoft.com/office/word/2010/wordprocessingShape" xmlns:a="http://schemas.openxmlformats.org/drawingml/2006/main" xmlns:pic="http://schemas.openxmlformats.org/drawingml/2006/picture" xmlns:a14="http://schemas.microsoft.com/office/drawing/2010/main" mc:Ignorable="w14 w15 w16se w16cid w16 w16cex w16sdtdh wp14">
+<w:ftr xmlns:wpc="http://schemas.microsoft.com/office/word/2010/wordprocessingCanvas" xmlns:cx="http://schemas.microsoft.com/office/drawing/2014/chartex" xmlns:cx1="http://schemas.microsoft.com/office/drawing/2015/9/8/chartex" xmlns:cx2="http://schemas.microsoft.com/office/drawing/2015/10/21/chartex" xmlns:cx3="http://schemas.microsoft.com/office/drawing/2016/5/9/chartex" xmlns:cx4="http://schemas.microsoft.com/office/drawing/2016/5/10/chartex" xmlns:cx5="http://schemas.microsoft.com/office/drawing/2016/5/11/chartex" xmlns:cx6="http://schemas.microsoft.com/office/drawing/2016/5/12/chartex" xmlns:cx7="http://schemas.microsoft.com/office/drawing/2016/5/13/chartex" xmlns:cx8="http://schemas.microsoft.com/office/drawing/2016/5/14/chartex" xmlns:mc="http://schemas.openxmlformats.org/markup-compatibility/2006" xmlns:aink="http://schemas.microsoft.com/office/drawing/2016/ink" xmlns:am3d="http://schemas.microsoft.com/office/drawing/2017/model3d" xmlns:o="urn:schemas-microsoft-com:office:office" xmlns:oel="http://schemas.microsoft.com/office/2019/extlst" xmlns:r="http://schemas.openxmlformats.org/officeDocument/2006/relationships" xmlns:m="http://schemas.openxmlformats.org/officeDocument/2006/math" xmlns:v="urn:schemas-microsoft-com:vml" xmlns:wp14="http://schemas.microsoft.com/office/word/2010/wordprocessingDrawing" xmlns:wp="http://schemas.openxmlformats.org/drawingml/2006/wordprocessingDrawing" xmlns:w10="urn:schemas-microsoft-com:office:word" xmlns:w="http://schemas.openxmlformats.org/wordprocessingml/2006/main" xmlns:w14="http://schemas.microsoft.com/office/word/2010/wordml" xmlns:w15="http://schemas.microsoft.com/office/word/2012/wordml" xmlns:w16cex="http://schemas.microsoft.com/office/word/2018/wordml/cex" xmlns:w16cid="http://schemas.microsoft.com/office/word/2016/wordml/cid" xmlns:w16="http://schemas.microsoft.com/office/word/2018/wordml" xmlns:w16du="http://schemas.microsoft.com/office/word/2023/wordml/word16du" xmlns:w16sdtdh="http://schemas.microsoft.com/office/word/2020/wordml/sdtdatahash" xmlns:w16sdtfl="http://schemas.microsoft.com/office/word/2024/wordml/sdtformatlock" xmlns:w16se="http://schemas.microsoft.com/office/word/2015/wordml/symex" xmlns:wpg="http://schemas.microsoft.com/office/word/2010/wordprocessingGroup" xmlns:wpi="http://schemas.microsoft.com/office/word/2010/wordprocessingInk" xmlns:wne="http://schemas.microsoft.com/office/word/2006/wordml" xmlns:wps="http://schemas.microsoft.com/office/word/2010/wordprocessingShape" mc:Ignorable="w14 w15 w16se w16cid w16 w16cex w16sdtdh w16sdtfl w16du wp14">
   <w:p>
     <w:pPr>
       <w:pStyle w:val="Footer-Pagenumber"/>
@@ -2089,7 +2051,7 @@
             </wp:anchor>
           </w:drawing>
         </mc:Choice>
-        <mc:Fallback>
+        <mc:Fallback xmlns:a14="http://schemas.microsoft.com/office/drawing/2010/main" xmlns:pic="http://schemas.openxmlformats.org/drawingml/2006/picture" xmlns:a="http://schemas.openxmlformats.org/drawingml/2006/main">
           <w:pict>
             <v:shapetype id="_x0000_t202" coordsize="21600,21600" o:spt="202" path="m,l,21600r21600,l21600,xe" w14:anchorId="6E9DAA25">
               <v:stroke joinstyle="miter"/>
@@ -2309,7 +2271,7 @@
 </file>
 
 <file path=word/footer3.xml><?xml version="1.0" encoding="utf-8"?>
-<w:ftr xmlns:wpc="http://schemas.microsoft.com/office/word/2010/wordprocessingCanvas" xmlns:cx="http://schemas.microsoft.com/office/drawing/2014/chartex" xmlns:cx1="http://schemas.microsoft.com/office/drawing/2015/9/8/chartex" xmlns:cx2="http://schemas.microsoft.com/office/drawing/2015/10/21/chartex" xmlns:cx3="http://schemas.microsoft.com/office/drawing/2016/5/9/chartex" xmlns:cx4="http://schemas.microsoft.com/office/drawing/2016/5/10/chartex" xmlns:cx5="http://schemas.microsoft.com/office/drawing/2016/5/11/chartex" xmlns:cx6="http://schemas.microsoft.com/office/drawing/2016/5/12/chartex" xmlns:cx7="http://schemas.microsoft.com/office/drawing/2016/5/13/chartex" xmlns:cx8="http://schemas.microsoft.com/office/drawing/2016/5/14/chartex" xmlns:mc="http://schemas.openxmlformats.org/markup-compatibility/2006" xmlns:aink="http://schemas.microsoft.com/office/drawing/2016/ink" xmlns:am3d="http://schemas.microsoft.com/office/drawing/2017/model3d" xmlns:o="urn:schemas-microsoft-com:office:office" xmlns:oel="http://schemas.microsoft.com/office/2019/extlst" xmlns:r="http://schemas.openxmlformats.org/officeDocument/2006/relationships" xmlns:m="http://schemas.openxmlformats.org/officeDocument/2006/math" xmlns:v="urn:schemas-microsoft-com:vml" xmlns:wp14="http://schemas.microsoft.com/office/word/2010/wordprocessingDrawing" xmlns:wp="http://schemas.openxmlformats.org/drawingml/2006/wordprocessingDrawing" xmlns:w10="urn:schemas-microsoft-com:office:word" xmlns:w="http://schemas.openxmlformats.org/wordprocessingml/2006/main" xmlns:w14="http://schemas.microsoft.com/office/word/2010/wordml" xmlns:w15="http://schemas.microsoft.com/office/word/2012/wordml" xmlns:w16cex="http://schemas.microsoft.com/office/word/2018/wordml/cex" xmlns:w16cid="http://schemas.microsoft.com/office/word/2016/wordml/cid" xmlns:w16="http://schemas.microsoft.com/office/word/2018/wordml" xmlns:w16sdtdh="http://schemas.microsoft.com/office/word/2020/wordml/sdtdatahash" xmlns:w16se="http://schemas.microsoft.com/office/word/2015/wordml/symex" xmlns:wpg="http://schemas.microsoft.com/office/word/2010/wordprocessingGroup" xmlns:wpi="http://schemas.microsoft.com/office/word/2010/wordprocessingInk" xmlns:wne="http://schemas.microsoft.com/office/word/2006/wordml" xmlns:wps="http://schemas.microsoft.com/office/word/2010/wordprocessingShape" mc:Ignorable="w14 w15 w16se w16cid w16 w16cex w16sdtdh wp14">
+<w:ftr xmlns:wpc="http://schemas.microsoft.com/office/word/2010/wordprocessingCanvas" xmlns:cx="http://schemas.microsoft.com/office/drawing/2014/chartex" xmlns:cx1="http://schemas.microsoft.com/office/drawing/2015/9/8/chartex" xmlns:cx2="http://schemas.microsoft.com/office/drawing/2015/10/21/chartex" xmlns:cx3="http://schemas.microsoft.com/office/drawing/2016/5/9/chartex" xmlns:cx4="http://schemas.microsoft.com/office/drawing/2016/5/10/chartex" xmlns:cx5="http://schemas.microsoft.com/office/drawing/2016/5/11/chartex" xmlns:cx6="http://schemas.microsoft.com/office/drawing/2016/5/12/chartex" xmlns:cx7="http://schemas.microsoft.com/office/drawing/2016/5/13/chartex" xmlns:cx8="http://schemas.microsoft.com/office/drawing/2016/5/14/chartex" xmlns:mc="http://schemas.openxmlformats.org/markup-compatibility/2006" xmlns:aink="http://schemas.microsoft.com/office/drawing/2016/ink" xmlns:am3d="http://schemas.microsoft.com/office/drawing/2017/model3d" xmlns:o="urn:schemas-microsoft-com:office:office" xmlns:oel="http://schemas.microsoft.com/office/2019/extlst" xmlns:r="http://schemas.openxmlformats.org/officeDocument/2006/relationships" xmlns:m="http://schemas.openxmlformats.org/officeDocument/2006/math" xmlns:v="urn:schemas-microsoft-com:vml" xmlns:wp14="http://schemas.microsoft.com/office/word/2010/wordprocessingDrawing" xmlns:wp="http://schemas.openxmlformats.org/drawingml/2006/wordprocessingDrawing" xmlns:w10="urn:schemas-microsoft-com:office:word" xmlns:w="http://schemas.openxmlformats.org/wordprocessingml/2006/main" xmlns:w14="http://schemas.microsoft.com/office/word/2010/wordml" xmlns:w15="http://schemas.microsoft.com/office/word/2012/wordml" xmlns:w16cex="http://schemas.microsoft.com/office/word/2018/wordml/cex" xmlns:w16cid="http://schemas.microsoft.com/office/word/2016/wordml/cid" xmlns:w16="http://schemas.microsoft.com/office/word/2018/wordml" xmlns:w16du="http://schemas.microsoft.com/office/word/2023/wordml/word16du" xmlns:w16sdtdh="http://schemas.microsoft.com/office/word/2020/wordml/sdtdatahash" xmlns:w16sdtfl="http://schemas.microsoft.com/office/word/2024/wordml/sdtformatlock" xmlns:w16se="http://schemas.microsoft.com/office/word/2015/wordml/symex" xmlns:wpg="http://schemas.microsoft.com/office/word/2010/wordprocessingGroup" xmlns:wpi="http://schemas.microsoft.com/office/word/2010/wordprocessingInk" xmlns:wne="http://schemas.microsoft.com/office/word/2006/wordml" xmlns:wps="http://schemas.microsoft.com/office/word/2010/wordprocessingShape" mc:Ignorable="w14 w15 w16se w16cid w16 w16cex w16sdtdh w16sdtfl w16du wp14">
   <w:p>
     <w:pPr>
       <w:pStyle w:val="Footer"/>
@@ -2319,7 +2281,7 @@
 </file>
 
 <file path=word/footnotes.xml><?xml version="1.0" encoding="utf-8"?>
-<w:footnotes xmlns:wpc="http://schemas.microsoft.com/office/word/2010/wordprocessingCanvas" xmlns:cx="http://schemas.microsoft.com/office/drawing/2014/chartex" xmlns:cx1="http://schemas.microsoft.com/office/drawing/2015/9/8/chartex" xmlns:cx2="http://schemas.microsoft.com/office/drawing/2015/10/21/chartex" xmlns:cx3="http://schemas.microsoft.com/office/drawing/2016/5/9/chartex" xmlns:cx4="http://schemas.microsoft.com/office/drawing/2016/5/10/chartex" xmlns:cx5="http://schemas.microsoft.com/office/drawing/2016/5/11/chartex" xmlns:cx6="http://schemas.microsoft.com/office/drawing/2016/5/12/chartex" xmlns:cx7="http://schemas.microsoft.com/office/drawing/2016/5/13/chartex" xmlns:cx8="http://schemas.microsoft.com/office/drawing/2016/5/14/chartex" xmlns:mc="http://schemas.openxmlformats.org/markup-compatibility/2006" xmlns:aink="http://schemas.microsoft.com/office/drawing/2016/ink" xmlns:am3d="http://schemas.microsoft.com/office/drawing/2017/model3d" xmlns:o="urn:schemas-microsoft-com:office:office" xmlns:oel="http://schemas.microsoft.com/office/2019/extlst" xmlns:r="http://schemas.openxmlformats.org/officeDocument/2006/relationships" xmlns:m="http://schemas.openxmlformats.org/officeDocument/2006/math" xmlns:v="urn:schemas-microsoft-com:vml" xmlns:wp14="http://schemas.microsoft.com/office/word/2010/wordprocessingDrawing" xmlns:wp="http://schemas.openxmlformats.org/drawingml/2006/wordprocessingDrawing" xmlns:w10="urn:schemas-microsoft-com:office:word" xmlns:w="http://schemas.openxmlformats.org/wordprocessingml/2006/main" xmlns:w14="http://schemas.microsoft.com/office/word/2010/wordml" xmlns:w15="http://schemas.microsoft.com/office/word/2012/wordml" xmlns:w16cex="http://schemas.microsoft.com/office/word/2018/wordml/cex" xmlns:w16cid="http://schemas.microsoft.com/office/word/2016/wordml/cid" xmlns:w16="http://schemas.microsoft.com/office/word/2018/wordml" xmlns:w16sdtdh="http://schemas.microsoft.com/office/word/2020/wordml/sdtdatahash" xmlns:w16se="http://schemas.microsoft.com/office/word/2015/wordml/symex" xmlns:wpg="http://schemas.microsoft.com/office/word/2010/wordprocessingGroup" xmlns:wpi="http://schemas.microsoft.com/office/word/2010/wordprocessingInk" xmlns:wne="http://schemas.microsoft.com/office/word/2006/wordml" xmlns:wps="http://schemas.microsoft.com/office/word/2010/wordprocessingShape" mc:Ignorable="w14 w15 w16se w16cid w16 w16cex w16sdtdh wp14">
+<w:footnotes xmlns:wpc="http://schemas.microsoft.com/office/word/2010/wordprocessingCanvas" xmlns:cx="http://schemas.microsoft.com/office/drawing/2014/chartex" xmlns:cx1="http://schemas.microsoft.com/office/drawing/2015/9/8/chartex" xmlns:cx2="http://schemas.microsoft.com/office/drawing/2015/10/21/chartex" xmlns:cx3="http://schemas.microsoft.com/office/drawing/2016/5/9/chartex" xmlns:cx4="http://schemas.microsoft.com/office/drawing/2016/5/10/chartex" xmlns:cx5="http://schemas.microsoft.com/office/drawing/2016/5/11/chartex" xmlns:cx6="http://schemas.microsoft.com/office/drawing/2016/5/12/chartex" xmlns:cx7="http://schemas.microsoft.com/office/drawing/2016/5/13/chartex" xmlns:cx8="http://schemas.microsoft.com/office/drawing/2016/5/14/chartex" xmlns:mc="http://schemas.openxmlformats.org/markup-compatibility/2006" xmlns:aink="http://schemas.microsoft.com/office/drawing/2016/ink" xmlns:am3d="http://schemas.microsoft.com/office/drawing/2017/model3d" xmlns:o="urn:schemas-microsoft-com:office:office" xmlns:oel="http://schemas.microsoft.com/office/2019/extlst" xmlns:r="http://schemas.openxmlformats.org/officeDocument/2006/relationships" xmlns:m="http://schemas.openxmlformats.org/officeDocument/2006/math" xmlns:v="urn:schemas-microsoft-com:vml" xmlns:wp14="http://schemas.microsoft.com/office/word/2010/wordprocessingDrawing" xmlns:wp="http://schemas.openxmlformats.org/drawingml/2006/wordprocessingDrawing" xmlns:w10="urn:schemas-microsoft-com:office:word" xmlns:w="http://schemas.openxmlformats.org/wordprocessingml/2006/main" xmlns:w14="http://schemas.microsoft.com/office/word/2010/wordml" xmlns:w15="http://schemas.microsoft.com/office/word/2012/wordml" xmlns:w16cex="http://schemas.microsoft.com/office/word/2018/wordml/cex" xmlns:w16cid="http://schemas.microsoft.com/office/word/2016/wordml/cid" xmlns:w16="http://schemas.microsoft.com/office/word/2018/wordml" xmlns:w16du="http://schemas.microsoft.com/office/word/2023/wordml/word16du" xmlns:w16sdtdh="http://schemas.microsoft.com/office/word/2020/wordml/sdtdatahash" xmlns:w16sdtfl="http://schemas.microsoft.com/office/word/2024/wordml/sdtformatlock" xmlns:w16se="http://schemas.microsoft.com/office/word/2015/wordml/symex" xmlns:wpg="http://schemas.microsoft.com/office/word/2010/wordprocessingGroup" xmlns:wpi="http://schemas.microsoft.com/office/word/2010/wordprocessingInk" xmlns:wne="http://schemas.microsoft.com/office/word/2006/wordml" xmlns:wps="http://schemas.microsoft.com/office/word/2010/wordprocessingShape" mc:Ignorable="w14 w15 w16se w16cid w16 w16cex w16sdtdh w16sdtfl w16du wp14">
   <w:footnote w:type="separator" w:id="-1">
     <w:p>
       <w:pPr>
@@ -2344,7 +2306,7 @@
 </file>
 
 <file path=word/header1.xml><?xml version="1.0" encoding="utf-8"?>
-<w:hdr xmlns:wpc="http://schemas.microsoft.com/office/word/2010/wordprocessingCanvas" xmlns:cx="http://schemas.microsoft.com/office/drawing/2014/chartex" xmlns:cx1="http://schemas.microsoft.com/office/drawing/2015/9/8/chartex" xmlns:cx2="http://schemas.microsoft.com/office/drawing/2015/10/21/chartex" xmlns:cx3="http://schemas.microsoft.com/office/drawing/2016/5/9/chartex" xmlns:cx4="http://schemas.microsoft.com/office/drawing/2016/5/10/chartex" xmlns:cx5="http://schemas.microsoft.com/office/drawing/2016/5/11/chartex" xmlns:cx6="http://schemas.microsoft.com/office/drawing/2016/5/12/chartex" xmlns:cx7="http://schemas.microsoft.com/office/drawing/2016/5/13/chartex" xmlns:cx8="http://schemas.microsoft.com/office/drawing/2016/5/14/chartex" xmlns:mc="http://schemas.openxmlformats.org/markup-compatibility/2006" xmlns:aink="http://schemas.microsoft.com/office/drawing/2016/ink" xmlns:am3d="http://schemas.microsoft.com/office/drawing/2017/model3d" xmlns:o="urn:schemas-microsoft-com:office:office" xmlns:oel="http://schemas.microsoft.com/office/2019/extlst" xmlns:r="http://schemas.openxmlformats.org/officeDocument/2006/relationships" xmlns:m="http://schemas.openxmlformats.org/officeDocument/2006/math" xmlns:v="urn:schemas-microsoft-com:vml" xmlns:wp14="http://schemas.microsoft.com/office/word/2010/wordprocessingDrawing" xmlns:wp="http://schemas.openxmlformats.org/drawingml/2006/wordprocessingDrawing" xmlns:w10="urn:schemas-microsoft-com:office:word" xmlns:w="http://schemas.openxmlformats.org/wordprocessingml/2006/main" xmlns:w14="http://schemas.microsoft.com/office/word/2010/wordml" xmlns:w15="http://schemas.microsoft.com/office/word/2012/wordml" xmlns:w16cex="http://schemas.microsoft.com/office/word/2018/wordml/cex" xmlns:w16cid="http://schemas.microsoft.com/office/word/2016/wordml/cid" xmlns:w16="http://schemas.microsoft.com/office/word/2018/wordml" xmlns:w16sdtdh="http://schemas.microsoft.com/office/word/2020/wordml/sdtdatahash" xmlns:w16se="http://schemas.microsoft.com/office/word/2015/wordml/symex" xmlns:wpg="http://schemas.microsoft.com/office/word/2010/wordprocessingGroup" xmlns:wpi="http://schemas.microsoft.com/office/word/2010/wordprocessingInk" xmlns:wne="http://schemas.microsoft.com/office/word/2006/wordml" xmlns:wps="http://schemas.microsoft.com/office/word/2010/wordprocessingShape" mc:Ignorable="w14 w15 w16se w16cid w16 w16cex w16sdtdh wp14">
+<w:hdr xmlns:wpc="http://schemas.microsoft.com/office/word/2010/wordprocessingCanvas" xmlns:cx="http://schemas.microsoft.com/office/drawing/2014/chartex" xmlns:cx1="http://schemas.microsoft.com/office/drawing/2015/9/8/chartex" xmlns:cx2="http://schemas.microsoft.com/office/drawing/2015/10/21/chartex" xmlns:cx3="http://schemas.microsoft.com/office/drawing/2016/5/9/chartex" xmlns:cx4="http://schemas.microsoft.com/office/drawing/2016/5/10/chartex" xmlns:cx5="http://schemas.microsoft.com/office/drawing/2016/5/11/chartex" xmlns:cx6="http://schemas.microsoft.com/office/drawing/2016/5/12/chartex" xmlns:cx7="http://schemas.microsoft.com/office/drawing/2016/5/13/chartex" xmlns:cx8="http://schemas.microsoft.com/office/drawing/2016/5/14/chartex" xmlns:mc="http://schemas.openxmlformats.org/markup-compatibility/2006" xmlns:aink="http://schemas.microsoft.com/office/drawing/2016/ink" xmlns:am3d="http://schemas.microsoft.com/office/drawing/2017/model3d" xmlns:o="urn:schemas-microsoft-com:office:office" xmlns:oel="http://schemas.microsoft.com/office/2019/extlst" xmlns:r="http://schemas.openxmlformats.org/officeDocument/2006/relationships" xmlns:m="http://schemas.openxmlformats.org/officeDocument/2006/math" xmlns:v="urn:schemas-microsoft-com:vml" xmlns:wp14="http://schemas.microsoft.com/office/word/2010/wordprocessingDrawing" xmlns:wp="http://schemas.openxmlformats.org/drawingml/2006/wordprocessingDrawing" xmlns:w10="urn:schemas-microsoft-com:office:word" xmlns:w="http://schemas.openxmlformats.org/wordprocessingml/2006/main" xmlns:w14="http://schemas.microsoft.com/office/word/2010/wordml" xmlns:w15="http://schemas.microsoft.com/office/word/2012/wordml" xmlns:w16cex="http://schemas.microsoft.com/office/word/2018/wordml/cex" xmlns:w16cid="http://schemas.microsoft.com/office/word/2016/wordml/cid" xmlns:w16="http://schemas.microsoft.com/office/word/2018/wordml" xmlns:w16du="http://schemas.microsoft.com/office/word/2023/wordml/word16du" xmlns:w16sdtdh="http://schemas.microsoft.com/office/word/2020/wordml/sdtdatahash" xmlns:w16sdtfl="http://schemas.microsoft.com/office/word/2024/wordml/sdtformatlock" xmlns:w16se="http://schemas.microsoft.com/office/word/2015/wordml/symex" xmlns:wpg="http://schemas.microsoft.com/office/word/2010/wordprocessingGroup" xmlns:wpi="http://schemas.microsoft.com/office/word/2010/wordprocessingInk" xmlns:wne="http://schemas.microsoft.com/office/word/2006/wordml" xmlns:wps="http://schemas.microsoft.com/office/word/2010/wordprocessingShape" mc:Ignorable="w14 w15 w16se w16cid w16 w16cex w16sdtdh w16sdtfl w16du wp14">
   <w:p>
     <w:pPr>
       <w:pStyle w:val="Header"/>
@@ -2354,7 +2316,7 @@
 </file>
 
 <file path=word/header2.xml><?xml version="1.0" encoding="utf-8"?>
-<w:hdr xmlns:wpc="http://schemas.microsoft.com/office/word/2010/wordprocessingCanvas" xmlns:cx="http://schemas.microsoft.com/office/drawing/2014/chartex" xmlns:cx1="http://schemas.microsoft.com/office/drawing/2015/9/8/chartex" xmlns:cx2="http://schemas.microsoft.com/office/drawing/2015/10/21/chartex" xmlns:cx3="http://schemas.microsoft.com/office/drawing/2016/5/9/chartex" xmlns:cx4="http://schemas.microsoft.com/office/drawing/2016/5/10/chartex" xmlns:cx5="http://schemas.microsoft.com/office/drawing/2016/5/11/chartex" xmlns:cx6="http://schemas.microsoft.com/office/drawing/2016/5/12/chartex" xmlns:cx7="http://schemas.microsoft.com/office/drawing/2016/5/13/chartex" xmlns:cx8="http://schemas.microsoft.com/office/drawing/2016/5/14/chartex" xmlns:mc="http://schemas.openxmlformats.org/markup-compatibility/2006" xmlns:aink="http://schemas.microsoft.com/office/drawing/2016/ink" xmlns:am3d="http://schemas.microsoft.com/office/drawing/2017/model3d" xmlns:o="urn:schemas-microsoft-com:office:office" xmlns:oel="http://schemas.microsoft.com/office/2019/extlst" xmlns:r="http://schemas.openxmlformats.org/officeDocument/2006/relationships" xmlns:m="http://schemas.openxmlformats.org/officeDocument/2006/math" xmlns:v="urn:schemas-microsoft-com:vml" xmlns:wp14="http://schemas.microsoft.com/office/word/2010/wordprocessingDrawing" xmlns:wp="http://schemas.openxmlformats.org/drawingml/2006/wordprocessingDrawing" xmlns:w10="urn:schemas-microsoft-com:office:word" xmlns:w="http://schemas.openxmlformats.org/wordprocessingml/2006/main" xmlns:w14="http://schemas.microsoft.com/office/word/2010/wordml" xmlns:w15="http://schemas.microsoft.com/office/word/2012/wordml" xmlns:w16cex="http://schemas.microsoft.com/office/word/2018/wordml/cex" xmlns:w16cid="http://schemas.microsoft.com/office/word/2016/wordml/cid" xmlns:w16="http://schemas.microsoft.com/office/word/2018/wordml" xmlns:w16sdtdh="http://schemas.microsoft.com/office/word/2020/wordml/sdtdatahash" xmlns:w16se="http://schemas.microsoft.com/office/word/2015/wordml/symex" xmlns:wpg="http://schemas.microsoft.com/office/word/2010/wordprocessingGroup" xmlns:wpi="http://schemas.microsoft.com/office/word/2010/wordprocessingInk" xmlns:wne="http://schemas.microsoft.com/office/word/2006/wordml" xmlns:wps="http://schemas.microsoft.com/office/word/2010/wordprocessingShape" mc:Ignorable="w14 w15 w16se w16cid w16 w16cex w16sdtdh wp14">
+<w:hdr xmlns:wpc="http://schemas.microsoft.com/office/word/2010/wordprocessingCanvas" xmlns:cx="http://schemas.microsoft.com/office/drawing/2014/chartex" xmlns:cx1="http://schemas.microsoft.com/office/drawing/2015/9/8/chartex" xmlns:cx2="http://schemas.microsoft.com/office/drawing/2015/10/21/chartex" xmlns:cx3="http://schemas.microsoft.com/office/drawing/2016/5/9/chartex" xmlns:cx4="http://schemas.microsoft.com/office/drawing/2016/5/10/chartex" xmlns:cx5="http://schemas.microsoft.com/office/drawing/2016/5/11/chartex" xmlns:cx6="http://schemas.microsoft.com/office/drawing/2016/5/12/chartex" xmlns:cx7="http://schemas.microsoft.com/office/drawing/2016/5/13/chartex" xmlns:cx8="http://schemas.microsoft.com/office/drawing/2016/5/14/chartex" xmlns:mc="http://schemas.openxmlformats.org/markup-compatibility/2006" xmlns:aink="http://schemas.microsoft.com/office/drawing/2016/ink" xmlns:am3d="http://schemas.microsoft.com/office/drawing/2017/model3d" xmlns:o="urn:schemas-microsoft-com:office:office" xmlns:oel="http://schemas.microsoft.com/office/2019/extlst" xmlns:r="http://schemas.openxmlformats.org/officeDocument/2006/relationships" xmlns:m="http://schemas.openxmlformats.org/officeDocument/2006/math" xmlns:v="urn:schemas-microsoft-com:vml" xmlns:wp14="http://schemas.microsoft.com/office/word/2010/wordprocessingDrawing" xmlns:wp="http://schemas.openxmlformats.org/drawingml/2006/wordprocessingDrawing" xmlns:w10="urn:schemas-microsoft-com:office:word" xmlns:w="http://schemas.openxmlformats.org/wordprocessingml/2006/main" xmlns:w14="http://schemas.microsoft.com/office/word/2010/wordml" xmlns:w15="http://schemas.microsoft.com/office/word/2012/wordml" xmlns:w16cex="http://schemas.microsoft.com/office/word/2018/wordml/cex" xmlns:w16cid="http://schemas.microsoft.com/office/word/2016/wordml/cid" xmlns:w16="http://schemas.microsoft.com/office/word/2018/wordml" xmlns:w16du="http://schemas.microsoft.com/office/word/2023/wordml/word16du" xmlns:w16sdtdh="http://schemas.microsoft.com/office/word/2020/wordml/sdtdatahash" xmlns:w16sdtfl="http://schemas.microsoft.com/office/word/2024/wordml/sdtformatlock" xmlns:w16se="http://schemas.microsoft.com/office/word/2015/wordml/symex" xmlns:wpg="http://schemas.microsoft.com/office/word/2010/wordprocessingGroup" xmlns:wpi="http://schemas.microsoft.com/office/word/2010/wordprocessingInk" xmlns:wne="http://schemas.microsoft.com/office/word/2006/wordml" xmlns:wps="http://schemas.microsoft.com/office/word/2010/wordprocessingShape" mc:Ignorable="w14 w15 w16se w16cid w16 w16cex w16sdtdh w16sdtfl w16du wp14">
   <w:p>
     <w:pPr>
       <w:pStyle w:val="Header"/>
@@ -2364,7 +2326,7 @@
 </file>
 
 <file path=word/header3.xml><?xml version="1.0" encoding="utf-8"?>
-<w:hdr xmlns:wpc="http://schemas.microsoft.com/office/word/2010/wordprocessingCanvas" xmlns:cx="http://schemas.microsoft.com/office/drawing/2014/chartex" xmlns:cx1="http://schemas.microsoft.com/office/drawing/2015/9/8/chartex" xmlns:cx2="http://schemas.microsoft.com/office/drawing/2015/10/21/chartex" xmlns:cx3="http://schemas.microsoft.com/office/drawing/2016/5/9/chartex" xmlns:cx4="http://schemas.microsoft.com/office/drawing/2016/5/10/chartex" xmlns:cx5="http://schemas.microsoft.com/office/drawing/2016/5/11/chartex" xmlns:cx6="http://schemas.microsoft.com/office/drawing/2016/5/12/chartex" xmlns:cx7="http://schemas.microsoft.com/office/drawing/2016/5/13/chartex" xmlns:cx8="http://schemas.microsoft.com/office/drawing/2016/5/14/chartex" xmlns:mc="http://schemas.openxmlformats.org/markup-compatibility/2006" xmlns:aink="http://schemas.microsoft.com/office/drawing/2016/ink" xmlns:am3d="http://schemas.microsoft.com/office/drawing/2017/model3d" xmlns:o="urn:schemas-microsoft-com:office:office" xmlns:oel="http://schemas.microsoft.com/office/2019/extlst" xmlns:r="http://schemas.openxmlformats.org/officeDocument/2006/relationships" xmlns:m="http://schemas.openxmlformats.org/officeDocument/2006/math" xmlns:v="urn:schemas-microsoft-com:vml" xmlns:wp14="http://schemas.microsoft.com/office/word/2010/wordprocessingDrawing" xmlns:wp="http://schemas.openxmlformats.org/drawingml/2006/wordprocessingDrawing" xmlns:w10="urn:schemas-microsoft-com:office:word" xmlns:w="http://schemas.openxmlformats.org/wordprocessingml/2006/main" xmlns:w14="http://schemas.microsoft.com/office/word/2010/wordml" xmlns:w15="http://schemas.microsoft.com/office/word/2012/wordml" xmlns:w16cex="http://schemas.microsoft.com/office/word/2018/wordml/cex" xmlns:w16cid="http://schemas.microsoft.com/office/word/2016/wordml/cid" xmlns:w16="http://schemas.microsoft.com/office/word/2018/wordml" xmlns:w16sdtdh="http://schemas.microsoft.com/office/word/2020/wordml/sdtdatahash" xmlns:w16se="http://schemas.microsoft.com/office/word/2015/wordml/symex" xmlns:wpg="http://schemas.microsoft.com/office/word/2010/wordprocessingGroup" xmlns:wpi="http://schemas.microsoft.com/office/word/2010/wordprocessingInk" xmlns:wne="http://schemas.microsoft.com/office/word/2006/wordml" xmlns:wps="http://schemas.microsoft.com/office/word/2010/wordprocessingShape" mc:Ignorable="w14 w15 w16se w16cid w16 w16cex w16sdtdh wp14">
+<w:hdr xmlns:wpc="http://schemas.microsoft.com/office/word/2010/wordprocessingCanvas" xmlns:cx="http://schemas.microsoft.com/office/drawing/2014/chartex" xmlns:cx1="http://schemas.microsoft.com/office/drawing/2015/9/8/chartex" xmlns:cx2="http://schemas.microsoft.com/office/drawing/2015/10/21/chartex" xmlns:cx3="http://schemas.microsoft.com/office/drawing/2016/5/9/chartex" xmlns:cx4="http://schemas.microsoft.com/office/drawing/2016/5/10/chartex" xmlns:cx5="http://schemas.microsoft.com/office/drawing/2016/5/11/chartex" xmlns:cx6="http://schemas.microsoft.com/office/drawing/2016/5/12/chartex" xmlns:cx7="http://schemas.microsoft.com/office/drawing/2016/5/13/chartex" xmlns:cx8="http://schemas.microsoft.com/office/drawing/2016/5/14/chartex" xmlns:mc="http://schemas.openxmlformats.org/markup-compatibility/2006" xmlns:aink="http://schemas.microsoft.com/office/drawing/2016/ink" xmlns:am3d="http://schemas.microsoft.com/office/drawing/2017/model3d" xmlns:o="urn:schemas-microsoft-com:office:office" xmlns:oel="http://schemas.microsoft.com/office/2019/extlst" xmlns:r="http://schemas.openxmlformats.org/officeDocument/2006/relationships" xmlns:m="http://schemas.openxmlformats.org/officeDocument/2006/math" xmlns:v="urn:schemas-microsoft-com:vml" xmlns:wp14="http://schemas.microsoft.com/office/word/2010/wordprocessingDrawing" xmlns:wp="http://schemas.openxmlformats.org/drawingml/2006/wordprocessingDrawing" xmlns:w10="urn:schemas-microsoft-com:office:word" xmlns:w="http://schemas.openxmlformats.org/wordprocessingml/2006/main" xmlns:w14="http://schemas.microsoft.com/office/word/2010/wordml" xmlns:w15="http://schemas.microsoft.com/office/word/2012/wordml" xmlns:w16cex="http://schemas.microsoft.com/office/word/2018/wordml/cex" xmlns:w16cid="http://schemas.microsoft.com/office/word/2016/wordml/cid" xmlns:w16="http://schemas.microsoft.com/office/word/2018/wordml" xmlns:w16du="http://schemas.microsoft.com/office/word/2023/wordml/word16du" xmlns:w16sdtdh="http://schemas.microsoft.com/office/word/2020/wordml/sdtdatahash" xmlns:w16sdtfl="http://schemas.microsoft.com/office/word/2024/wordml/sdtformatlock" xmlns:w16se="http://schemas.microsoft.com/office/word/2015/wordml/symex" xmlns:wpg="http://schemas.microsoft.com/office/word/2010/wordprocessingGroup" xmlns:wpi="http://schemas.microsoft.com/office/word/2010/wordprocessingInk" xmlns:wne="http://schemas.microsoft.com/office/word/2006/wordml" xmlns:wps="http://schemas.microsoft.com/office/word/2010/wordprocessingShape" mc:Ignorable="w14 w15 w16se w16cid w16 w16cex w16sdtdh w16sdtfl w16du wp14">
   <w:p>
     <w:pPr>
       <w:pStyle w:val="Header"/>
@@ -2374,7 +2336,7 @@
 </file>
 
 <file path=word/numbering.xml><?xml version="1.0" encoding="utf-8"?>
-<w:numbering xmlns:wpc="http://schemas.microsoft.com/office/word/2010/wordprocessingCanvas" xmlns:cx="http://schemas.microsoft.com/office/drawing/2014/chartex" xmlns:cx1="http://schemas.microsoft.com/office/drawing/2015/9/8/chartex" xmlns:cx2="http://schemas.microsoft.com/office/drawing/2015/10/21/chartex" xmlns:cx3="http://schemas.microsoft.com/office/drawing/2016/5/9/chartex" xmlns:cx4="http://schemas.microsoft.com/office/drawing/2016/5/10/chartex" xmlns:cx5="http://schemas.microsoft.com/office/drawing/2016/5/11/chartex" xmlns:cx6="http://schemas.microsoft.com/office/drawing/2016/5/12/chartex" xmlns:cx7="http://schemas.microsoft.com/office/drawing/2016/5/13/chartex" xmlns:cx8="http://schemas.microsoft.com/office/drawing/2016/5/14/chartex" xmlns:mc="http://schemas.openxmlformats.org/markup-compatibility/2006" xmlns:aink="http://schemas.microsoft.com/office/drawing/2016/ink" xmlns:am3d="http://schemas.microsoft.com/office/drawing/2017/model3d" xmlns:o="urn:schemas-microsoft-com:office:office" xmlns:oel="http://schemas.microsoft.com/office/2019/extlst" xmlns:r="http://schemas.openxmlformats.org/officeDocument/2006/relationships" xmlns:m="http://schemas.openxmlformats.org/officeDocument/2006/math" xmlns:v="urn:schemas-microsoft-com:vml" xmlns:wp14="http://schemas.microsoft.com/office/word/2010/wordprocessingDrawing" xmlns:wp="http://schemas.openxmlformats.org/drawingml/2006/wordprocessingDrawing" xmlns:w10="urn:schemas-microsoft-com:office:word" xmlns:w="http://schemas.openxmlformats.org/wordprocessingml/2006/main" xmlns:w14="http://schemas.microsoft.com/office/word/2010/wordml" xmlns:w15="http://schemas.microsoft.com/office/word/2012/wordml" xmlns:w16cex="http://schemas.microsoft.com/office/word/2018/wordml/cex" xmlns:w16cid="http://schemas.microsoft.com/office/word/2016/wordml/cid" xmlns:w16="http://schemas.microsoft.com/office/word/2018/wordml" xmlns:w16sdtdh="http://schemas.microsoft.com/office/word/2020/wordml/sdtdatahash" xmlns:w16se="http://schemas.microsoft.com/office/word/2015/wordml/symex" xmlns:wpg="http://schemas.microsoft.com/office/word/2010/wordprocessingGroup" xmlns:wpi="http://schemas.microsoft.com/office/word/2010/wordprocessingInk" xmlns:wne="http://schemas.microsoft.com/office/word/2006/wordml" xmlns:wps="http://schemas.microsoft.com/office/word/2010/wordprocessingShape" mc:Ignorable="w14 w15 w16se w16cid w16 w16cex w16sdtdh wp14">
+<w:numbering xmlns:wpc="http://schemas.microsoft.com/office/word/2010/wordprocessingCanvas" xmlns:cx="http://schemas.microsoft.com/office/drawing/2014/chartex" xmlns:cx1="http://schemas.microsoft.com/office/drawing/2015/9/8/chartex" xmlns:cx2="http://schemas.microsoft.com/office/drawing/2015/10/21/chartex" xmlns:cx3="http://schemas.microsoft.com/office/drawing/2016/5/9/chartex" xmlns:cx4="http://schemas.microsoft.com/office/drawing/2016/5/10/chartex" xmlns:cx5="http://schemas.microsoft.com/office/drawing/2016/5/11/chartex" xmlns:cx6="http://schemas.microsoft.com/office/drawing/2016/5/12/chartex" xmlns:cx7="http://schemas.microsoft.com/office/drawing/2016/5/13/chartex" xmlns:cx8="http://schemas.microsoft.com/office/drawing/2016/5/14/chartex" xmlns:mc="http://schemas.openxmlformats.org/markup-compatibility/2006" xmlns:aink="http://schemas.microsoft.com/office/drawing/2016/ink" xmlns:am3d="http://schemas.microsoft.com/office/drawing/2017/model3d" xmlns:o="urn:schemas-microsoft-com:office:office" xmlns:oel="http://schemas.microsoft.com/office/2019/extlst" xmlns:r="http://schemas.openxmlformats.org/officeDocument/2006/relationships" xmlns:m="http://schemas.openxmlformats.org/officeDocument/2006/math" xmlns:v="urn:schemas-microsoft-com:vml" xmlns:wp14="http://schemas.microsoft.com/office/word/2010/wordprocessingDrawing" xmlns:wp="http://schemas.openxmlformats.org/drawingml/2006/wordprocessingDrawing" xmlns:w10="urn:schemas-microsoft-com:office:word" xmlns:w="http://schemas.openxmlformats.org/wordprocessingml/2006/main" xmlns:w14="http://schemas.microsoft.com/office/word/2010/wordml" xmlns:w15="http://schemas.microsoft.com/office/word/2012/wordml" xmlns:w16cex="http://schemas.microsoft.com/office/word/2018/wordml/cex" xmlns:w16cid="http://schemas.microsoft.com/office/word/2016/wordml/cid" xmlns:w16="http://schemas.microsoft.com/office/word/2018/wordml" xmlns:w16du="http://schemas.microsoft.com/office/word/2023/wordml/word16du" xmlns:w16sdtdh="http://schemas.microsoft.com/office/word/2020/wordml/sdtdatahash" xmlns:w16sdtfl="http://schemas.microsoft.com/office/word/2024/wordml/sdtformatlock" xmlns:w16se="http://schemas.microsoft.com/office/word/2015/wordml/symex" xmlns:wpg="http://schemas.microsoft.com/office/word/2010/wordprocessingGroup" xmlns:wpi="http://schemas.microsoft.com/office/word/2010/wordprocessingInk" xmlns:wne="http://schemas.microsoft.com/office/word/2006/wordml" xmlns:wps="http://schemas.microsoft.com/office/word/2010/wordprocessingShape" mc:Ignorable="w14 w15 w16se w16cid w16 w16cex w16sdtdh w16sdtfl w16du wp14">
   <w:abstractNum w:abstractNumId="0" w15:restartNumberingAfterBreak="0">
     <w:nsid w:val="08A71424"/>
     <w:multiLevelType w:val="hybridMultilevel"/>
@@ -2392,7 +2354,7 @@
         <w:ind w:left="2335" w:hanging="284"/>
       </w:pPr>
       <w:rPr>
-        <w:rFonts w:hint="default" w:ascii="Arial" w:hAnsi="Arial"/>
+        <w:rFonts w:ascii="Arial" w:hAnsi="Arial" w:hint="default"/>
         <w:color w:val="auto"/>
         <w:sz w:val="21"/>
         <w:szCs w:val="24"/>
@@ -2407,7 +2369,7 @@
         <w:ind w:left="3491" w:hanging="360"/>
       </w:pPr>
       <w:rPr>
-        <w:rFonts w:hint="default" w:ascii="Courier New" w:hAnsi="Courier New"/>
+        <w:rFonts w:ascii="Courier New" w:hAnsi="Courier New" w:hint="default"/>
       </w:rPr>
     </w:lvl>
     <w:lvl w:ilvl="2" w:tplc="04090005" w:tentative="1">
@@ -2419,7 +2381,7 @@
         <w:ind w:left="4211" w:hanging="360"/>
       </w:pPr>
       <w:rPr>
-        <w:rFonts w:hint="default" w:ascii="Wingdings" w:hAnsi="Wingdings"/>
+        <w:rFonts w:ascii="Wingdings" w:hAnsi="Wingdings" w:hint="default"/>
       </w:rPr>
     </w:lvl>
     <w:lvl w:ilvl="3" w:tplc="04090001" w:tentative="1">
@@ -2431,7 +2393,7 @@
         <w:ind w:left="4931" w:hanging="360"/>
       </w:pPr>
       <w:rPr>
-        <w:rFonts w:hint="default" w:ascii="Symbol" w:hAnsi="Symbol"/>
+        <w:rFonts w:ascii="Symbol" w:hAnsi="Symbol" w:hint="default"/>
       </w:rPr>
     </w:lvl>
     <w:lvl w:ilvl="4" w:tplc="04090003" w:tentative="1">
@@ -2443,7 +2405,7 @@
         <w:ind w:left="5651" w:hanging="360"/>
       </w:pPr>
       <w:rPr>
-        <w:rFonts w:hint="default" w:ascii="Courier New" w:hAnsi="Courier New"/>
+        <w:rFonts w:ascii="Courier New" w:hAnsi="Courier New" w:hint="default"/>
       </w:rPr>
     </w:lvl>
     <w:lvl w:ilvl="5" w:tplc="04090005" w:tentative="1">
@@ -2455,7 +2417,7 @@
         <w:ind w:left="6371" w:hanging="360"/>
       </w:pPr>
       <w:rPr>
-        <w:rFonts w:hint="default" w:ascii="Wingdings" w:hAnsi="Wingdings"/>
+        <w:rFonts w:ascii="Wingdings" w:hAnsi="Wingdings" w:hint="default"/>
       </w:rPr>
     </w:lvl>
     <w:lvl w:ilvl="6" w:tplc="04090001" w:tentative="1">
@@ -2467,7 +2429,7 @@
         <w:ind w:left="7091" w:hanging="360"/>
       </w:pPr>
       <w:rPr>
-        <w:rFonts w:hint="default" w:ascii="Symbol" w:hAnsi="Symbol"/>
+        <w:rFonts w:ascii="Symbol" w:hAnsi="Symbol" w:hint="default"/>
       </w:rPr>
     </w:lvl>
     <w:lvl w:ilvl="7" w:tplc="04090003" w:tentative="1">
@@ -2479,7 +2441,7 @@
         <w:ind w:left="7811" w:hanging="360"/>
       </w:pPr>
       <w:rPr>
-        <w:rFonts w:hint="default" w:ascii="Courier New" w:hAnsi="Courier New"/>
+        <w:rFonts w:ascii="Courier New" w:hAnsi="Courier New" w:hint="default"/>
       </w:rPr>
     </w:lvl>
     <w:lvl w:ilvl="8" w:tplc="04090005" w:tentative="1">
@@ -2491,7 +2453,7 @@
         <w:ind w:left="8531" w:hanging="360"/>
       </w:pPr>
       <w:rPr>
-        <w:rFonts w:hint="default" w:ascii="Wingdings" w:hAnsi="Wingdings"/>
+        <w:rFonts w:ascii="Wingdings" w:hAnsi="Wingdings" w:hint="default"/>
       </w:rPr>
     </w:lvl>
   </w:abstractNum>
@@ -2509,7 +2471,7 @@
         <w:ind w:left="360" w:hanging="360"/>
       </w:pPr>
       <w:rPr>
-        <w:rFonts w:hint="default" w:ascii="Arial" w:hAnsi="Arial"/>
+        <w:rFonts w:ascii="Arial" w:hAnsi="Arial" w:hint="default"/>
         <w:b w:val="0"/>
         <w:i w:val="0"/>
         <w:caps w:val="0"/>
@@ -2531,7 +2493,7 @@
         <w:ind w:left="1440" w:hanging="360"/>
       </w:pPr>
       <w:rPr>
-        <w:rFonts w:hint="default" w:ascii="Courier New" w:hAnsi="Courier New" w:cs="Courier New"/>
+        <w:rFonts w:ascii="Courier New" w:hAnsi="Courier New" w:cs="Courier New" w:hint="default"/>
       </w:rPr>
     </w:lvl>
     <w:lvl w:ilvl="2" w:tplc="0C090005" w:tentative="1">
@@ -2543,7 +2505,7 @@
         <w:ind w:left="2160" w:hanging="360"/>
       </w:pPr>
       <w:rPr>
-        <w:rFonts w:hint="default" w:ascii="Wingdings" w:hAnsi="Wingdings"/>
+        <w:rFonts w:ascii="Wingdings" w:hAnsi="Wingdings" w:hint="default"/>
       </w:rPr>
     </w:lvl>
     <w:lvl w:ilvl="3" w:tplc="0C090001" w:tentative="1">
@@ -2555,7 +2517,7 @@
         <w:ind w:left="2880" w:hanging="360"/>
       </w:pPr>
       <w:rPr>
-        <w:rFonts w:hint="default" w:ascii="Symbol" w:hAnsi="Symbol"/>
+        <w:rFonts w:ascii="Symbol" w:hAnsi="Symbol" w:hint="default"/>
       </w:rPr>
     </w:lvl>
     <w:lvl w:ilvl="4" w:tplc="0C090003" w:tentative="1">
@@ -2567,7 +2529,7 @@
         <w:ind w:left="3600" w:hanging="360"/>
       </w:pPr>
       <w:rPr>
-        <w:rFonts w:hint="default" w:ascii="Courier New" w:hAnsi="Courier New" w:cs="Courier New"/>
+        <w:rFonts w:ascii="Courier New" w:hAnsi="Courier New" w:cs="Courier New" w:hint="default"/>
       </w:rPr>
     </w:lvl>
     <w:lvl w:ilvl="5" w:tplc="0C090005" w:tentative="1">
@@ -2579,7 +2541,7 @@
         <w:ind w:left="4320" w:hanging="360"/>
       </w:pPr>
       <w:rPr>
-        <w:rFonts w:hint="default" w:ascii="Wingdings" w:hAnsi="Wingdings"/>
+        <w:rFonts w:ascii="Wingdings" w:hAnsi="Wingdings" w:hint="default"/>
       </w:rPr>
     </w:lvl>
     <w:lvl w:ilvl="6" w:tplc="0C090001" w:tentative="1">
@@ -2591,7 +2553,7 @@
         <w:ind w:left="5040" w:hanging="360"/>
       </w:pPr>
       <w:rPr>
-        <w:rFonts w:hint="default" w:ascii="Symbol" w:hAnsi="Symbol"/>
+        <w:rFonts w:ascii="Symbol" w:hAnsi="Symbol" w:hint="default"/>
       </w:rPr>
     </w:lvl>
     <w:lvl w:ilvl="7" w:tplc="0C090003" w:tentative="1">
@@ -2603,7 +2565,7 @@
         <w:ind w:left="5760" w:hanging="360"/>
       </w:pPr>
       <w:rPr>
-        <w:rFonts w:hint="default" w:ascii="Courier New" w:hAnsi="Courier New" w:cs="Courier New"/>
+        <w:rFonts w:ascii="Courier New" w:hAnsi="Courier New" w:cs="Courier New" w:hint="default"/>
       </w:rPr>
     </w:lvl>
     <w:lvl w:ilvl="8" w:tplc="0C090005" w:tentative="1">
@@ -2615,7 +2577,7 @@
         <w:ind w:left="6480" w:hanging="360"/>
       </w:pPr>
       <w:rPr>
-        <w:rFonts w:hint="default" w:ascii="Wingdings" w:hAnsi="Wingdings"/>
+        <w:rFonts w:ascii="Wingdings" w:hAnsi="Wingdings" w:hint="default"/>
       </w:rPr>
     </w:lvl>
   </w:abstractNum>
@@ -2633,7 +2595,7 @@
         <w:ind w:left="720" w:hanging="360"/>
       </w:pPr>
       <w:rPr>
-        <w:rFonts w:hint="default" w:ascii="Courier New" w:hAnsi="Courier New"/>
+        <w:rFonts w:ascii="Courier New" w:hAnsi="Courier New" w:hint="default"/>
         <w:color w:val="auto"/>
         <w:position w:val="3"/>
         <w:sz w:val="16"/>
@@ -2648,7 +2610,7 @@
         <w:ind w:left="1440" w:hanging="360"/>
       </w:pPr>
       <w:rPr>
-        <w:rFonts w:hint="default" w:ascii="Courier New" w:hAnsi="Courier New" w:cs="Courier New"/>
+        <w:rFonts w:ascii="Courier New" w:hAnsi="Courier New" w:cs="Courier New" w:hint="default"/>
       </w:rPr>
     </w:lvl>
     <w:lvl w:ilvl="2" w:tplc="0C090005" w:tentative="1">
@@ -2660,7 +2622,7 @@
         <w:ind w:left="2160" w:hanging="360"/>
       </w:pPr>
       <w:rPr>
-        <w:rFonts w:hint="default" w:ascii="Wingdings" w:hAnsi="Wingdings"/>
+        <w:rFonts w:ascii="Wingdings" w:hAnsi="Wingdings" w:hint="default"/>
       </w:rPr>
     </w:lvl>
     <w:lvl w:ilvl="3" w:tplc="0C090001" w:tentative="1">
@@ -2672,7 +2634,7 @@
         <w:ind w:left="2880" w:hanging="360"/>
       </w:pPr>
       <w:rPr>
-        <w:rFonts w:hint="default" w:ascii="Symbol" w:hAnsi="Symbol"/>
+        <w:rFonts w:ascii="Symbol" w:hAnsi="Symbol" w:hint="default"/>
       </w:rPr>
     </w:lvl>
     <w:lvl w:ilvl="4" w:tplc="0C090003" w:tentative="1">
@@ -2684,7 +2646,7 @@
         <w:ind w:left="3600" w:hanging="360"/>
       </w:pPr>
       <w:rPr>
-        <w:rFonts w:hint="default" w:ascii="Courier New" w:hAnsi="Courier New" w:cs="Courier New"/>
+        <w:rFonts w:ascii="Courier New" w:hAnsi="Courier New" w:cs="Courier New" w:hint="default"/>
       </w:rPr>
     </w:lvl>
     <w:lvl w:ilvl="5" w:tplc="0C090005" w:tentative="1">
@@ -2696,7 +2658,7 @@
         <w:ind w:left="4320" w:hanging="360"/>
       </w:pPr>
       <w:rPr>
-        <w:rFonts w:hint="default" w:ascii="Wingdings" w:hAnsi="Wingdings"/>
+        <w:rFonts w:ascii="Wingdings" w:hAnsi="Wingdings" w:hint="default"/>
       </w:rPr>
     </w:lvl>
     <w:lvl w:ilvl="6" w:tplc="0C090001" w:tentative="1">
@@ -2708,7 +2670,7 @@
         <w:ind w:left="5040" w:hanging="360"/>
       </w:pPr>
       <w:rPr>
-        <w:rFonts w:hint="default" w:ascii="Symbol" w:hAnsi="Symbol"/>
+        <w:rFonts w:ascii="Symbol" w:hAnsi="Symbol" w:hint="default"/>
       </w:rPr>
     </w:lvl>
     <w:lvl w:ilvl="7" w:tplc="0C090003" w:tentative="1">
@@ -2720,7 +2682,7 @@
         <w:ind w:left="5760" w:hanging="360"/>
       </w:pPr>
       <w:rPr>
-        <w:rFonts w:hint="default" w:ascii="Courier New" w:hAnsi="Courier New" w:cs="Courier New"/>
+        <w:rFonts w:ascii="Courier New" w:hAnsi="Courier New" w:cs="Courier New" w:hint="default"/>
       </w:rPr>
     </w:lvl>
     <w:lvl w:ilvl="8" w:tplc="0C090005" w:tentative="1">
@@ -2732,7 +2694,7 @@
         <w:ind w:left="6480" w:hanging="360"/>
       </w:pPr>
       <w:rPr>
-        <w:rFonts w:hint="default" w:ascii="Wingdings" w:hAnsi="Wingdings"/>
+        <w:rFonts w:ascii="Wingdings" w:hAnsi="Wingdings" w:hint="default"/>
       </w:rPr>
     </w:lvl>
   </w:abstractNum>
@@ -2748,7 +2710,7 @@
         <w:ind w:left="720" w:hanging="360"/>
       </w:pPr>
       <w:rPr>
-        <w:rFonts w:hint="default" w:ascii="Symbol" w:hAnsi="Symbol" w:eastAsia="SimSun" w:cs="Times New Roman"/>
+        <w:rFonts w:ascii="Symbol" w:eastAsia="SimSun" w:hAnsi="Symbol" w:cs="Times New Roman" w:hint="default"/>
       </w:rPr>
     </w:lvl>
     <w:lvl w:ilvl="1" w:tplc="0C090003" w:tentative="1">
@@ -2760,7 +2722,7 @@
         <w:ind w:left="1440" w:hanging="360"/>
       </w:pPr>
       <w:rPr>
-        <w:rFonts w:hint="default" w:ascii="Courier New" w:hAnsi="Courier New" w:cs="Courier New"/>
+        <w:rFonts w:ascii="Courier New" w:hAnsi="Courier New" w:cs="Courier New" w:hint="default"/>
       </w:rPr>
     </w:lvl>
     <w:lvl w:ilvl="2" w:tplc="0C090005" w:tentative="1">
@@ -2772,7 +2734,7 @@
         <w:ind w:left="2160" w:hanging="360"/>
       </w:pPr>
       <w:rPr>
-        <w:rFonts w:hint="default" w:ascii="Wingdings" w:hAnsi="Wingdings"/>
+        <w:rFonts w:ascii="Wingdings" w:hAnsi="Wingdings" w:hint="default"/>
       </w:rPr>
     </w:lvl>
     <w:lvl w:ilvl="3" w:tplc="0C090001" w:tentative="1">
@@ -2784,7 +2746,7 @@
         <w:ind w:left="2880" w:hanging="360"/>
       </w:pPr>
       <w:rPr>
-        <w:rFonts w:hint="default" w:ascii="Symbol" w:hAnsi="Symbol"/>
+        <w:rFonts w:ascii="Symbol" w:hAnsi="Symbol" w:hint="default"/>
       </w:rPr>
     </w:lvl>
     <w:lvl w:ilvl="4" w:tplc="0C090003" w:tentative="1">
@@ -2796,7 +2758,7 @@
         <w:ind w:left="3600" w:hanging="360"/>
       </w:pPr>
       <w:rPr>
-        <w:rFonts w:hint="default" w:ascii="Courier New" w:hAnsi="Courier New" w:cs="Courier New"/>
+        <w:rFonts w:ascii="Courier New" w:hAnsi="Courier New" w:cs="Courier New" w:hint="default"/>
       </w:rPr>
     </w:lvl>
     <w:lvl w:ilvl="5" w:tplc="0C090005" w:tentative="1">
@@ -2808,7 +2770,7 @@
         <w:ind w:left="4320" w:hanging="360"/>
       </w:pPr>
       <w:rPr>
-        <w:rFonts w:hint="default" w:ascii="Wingdings" w:hAnsi="Wingdings"/>
+        <w:rFonts w:ascii="Wingdings" w:hAnsi="Wingdings" w:hint="default"/>
       </w:rPr>
     </w:lvl>
     <w:lvl w:ilvl="6" w:tplc="0C090001" w:tentative="1">
@@ -2820,7 +2782,7 @@
         <w:ind w:left="5040" w:hanging="360"/>
       </w:pPr>
       <w:rPr>
-        <w:rFonts w:hint="default" w:ascii="Symbol" w:hAnsi="Symbol"/>
+        <w:rFonts w:ascii="Symbol" w:hAnsi="Symbol" w:hint="default"/>
       </w:rPr>
     </w:lvl>
     <w:lvl w:ilvl="7" w:tplc="0C090003" w:tentative="1">
@@ -2832,7 +2794,7 @@
         <w:ind w:left="5760" w:hanging="360"/>
       </w:pPr>
       <w:rPr>
-        <w:rFonts w:hint="default" w:ascii="Courier New" w:hAnsi="Courier New" w:cs="Courier New"/>
+        <w:rFonts w:ascii="Courier New" w:hAnsi="Courier New" w:cs="Courier New" w:hint="default"/>
       </w:rPr>
     </w:lvl>
     <w:lvl w:ilvl="8" w:tplc="0C090005" w:tentative="1">
@@ -2844,7 +2806,7 @@
         <w:ind w:left="6480" w:hanging="360"/>
       </w:pPr>
       <w:rPr>
-        <w:rFonts w:hint="default" w:ascii="Wingdings" w:hAnsi="Wingdings"/>
+        <w:rFonts w:ascii="Wingdings" w:hAnsi="Wingdings" w:hint="default"/>
       </w:rPr>
     </w:lvl>
   </w:abstractNum>
@@ -2862,7 +2824,7 @@
         <w:ind w:left="720" w:hanging="360"/>
       </w:pPr>
       <w:rPr>
-        <w:rFonts w:hint="default" w:ascii="Arial" w:hAnsi="Arial"/>
+        <w:rFonts w:ascii="Arial" w:hAnsi="Arial" w:hint="default"/>
         <w:b w:val="0"/>
         <w:i w:val="0"/>
         <w:color w:val="000000" w:themeColor="text1"/>
@@ -2954,7 +2916,7 @@
         <w:ind w:left="720" w:hanging="360"/>
       </w:pPr>
       <w:rPr>
-        <w:rFonts w:hint="default" w:ascii="Symbol" w:hAnsi="Symbol" w:eastAsia="SimSun" w:cs="Times New Roman"/>
+        <w:rFonts w:ascii="Symbol" w:eastAsia="SimSun" w:hAnsi="Symbol" w:cs="Times New Roman" w:hint="default"/>
       </w:rPr>
     </w:lvl>
     <w:lvl w:ilvl="1" w:tplc="0C090003" w:tentative="1">
@@ -2966,7 +2928,7 @@
         <w:ind w:left="1440" w:hanging="360"/>
       </w:pPr>
       <w:rPr>
-        <w:rFonts w:hint="default" w:ascii="Courier New" w:hAnsi="Courier New" w:cs="Courier New"/>
+        <w:rFonts w:ascii="Courier New" w:hAnsi="Courier New" w:cs="Courier New" w:hint="default"/>
       </w:rPr>
     </w:lvl>
     <w:lvl w:ilvl="2" w:tplc="0C090005" w:tentative="1">
@@ -2978,7 +2940,7 @@
         <w:ind w:left="2160" w:hanging="360"/>
       </w:pPr>
       <w:rPr>
-        <w:rFonts w:hint="default" w:ascii="Wingdings" w:hAnsi="Wingdings"/>
+        <w:rFonts w:ascii="Wingdings" w:hAnsi="Wingdings" w:hint="default"/>
       </w:rPr>
     </w:lvl>
     <w:lvl w:ilvl="3" w:tplc="0C090001" w:tentative="1">
@@ -2990,7 +2952,7 @@
         <w:ind w:left="2880" w:hanging="360"/>
       </w:pPr>
       <w:rPr>
-        <w:rFonts w:hint="default" w:ascii="Symbol" w:hAnsi="Symbol"/>
+        <w:rFonts w:ascii="Symbol" w:hAnsi="Symbol" w:hint="default"/>
       </w:rPr>
     </w:lvl>
     <w:lvl w:ilvl="4" w:tplc="0C090003" w:tentative="1">
@@ -3002,7 +2964,7 @@
         <w:ind w:left="3600" w:hanging="360"/>
       </w:pPr>
       <w:rPr>
-        <w:rFonts w:hint="default" w:ascii="Courier New" w:hAnsi="Courier New" w:cs="Courier New"/>
+        <w:rFonts w:ascii="Courier New" w:hAnsi="Courier New" w:cs="Courier New" w:hint="default"/>
       </w:rPr>
     </w:lvl>
     <w:lvl w:ilvl="5" w:tplc="0C090005" w:tentative="1">
@@ -3014,7 +2976,7 @@
         <w:ind w:left="4320" w:hanging="360"/>
       </w:pPr>
       <w:rPr>
-        <w:rFonts w:hint="default" w:ascii="Wingdings" w:hAnsi="Wingdings"/>
+        <w:rFonts w:ascii="Wingdings" w:hAnsi="Wingdings" w:hint="default"/>
       </w:rPr>
     </w:lvl>
     <w:lvl w:ilvl="6" w:tplc="0C090001" w:tentative="1">
@@ -3026,7 +2988,7 @@
         <w:ind w:left="5040" w:hanging="360"/>
       </w:pPr>
       <w:rPr>
-        <w:rFonts w:hint="default" w:ascii="Symbol" w:hAnsi="Symbol"/>
+        <w:rFonts w:ascii="Symbol" w:hAnsi="Symbol" w:hint="default"/>
       </w:rPr>
     </w:lvl>
     <w:lvl w:ilvl="7" w:tplc="0C090003" w:tentative="1">
@@ -3038,7 +3000,7 @@
         <w:ind w:left="5760" w:hanging="360"/>
       </w:pPr>
       <w:rPr>
-        <w:rFonts w:hint="default" w:ascii="Courier New" w:hAnsi="Courier New" w:cs="Courier New"/>
+        <w:rFonts w:ascii="Courier New" w:hAnsi="Courier New" w:cs="Courier New" w:hint="default"/>
       </w:rPr>
     </w:lvl>
     <w:lvl w:ilvl="8" w:tplc="0C090005" w:tentative="1">
@@ -3050,7 +3012,7 @@
         <w:ind w:left="6480" w:hanging="360"/>
       </w:pPr>
       <w:rPr>
-        <w:rFonts w:hint="default" w:ascii="Wingdings" w:hAnsi="Wingdings"/>
+        <w:rFonts w:ascii="Wingdings" w:hAnsi="Wingdings" w:hint="default"/>
       </w:rPr>
     </w:lvl>
   </w:abstractNum>
@@ -3076,11 +3038,11 @@
 </file>
 
 <file path=word/styles.xml><?xml version="1.0" encoding="utf-8"?>
-<w:styles xmlns:mc="http://schemas.openxmlformats.org/markup-compatibility/2006" xmlns:r="http://schemas.openxmlformats.org/officeDocument/2006/relationships" xmlns:w="http://schemas.openxmlformats.org/wordprocessingml/2006/main" xmlns:w14="http://schemas.microsoft.com/office/word/2010/wordml" xmlns:w15="http://schemas.microsoft.com/office/word/2012/wordml" xmlns:w16cex="http://schemas.microsoft.com/office/word/2018/wordml/cex" xmlns:w16cid="http://schemas.microsoft.com/office/word/2016/wordml/cid" xmlns:w16="http://schemas.microsoft.com/office/word/2018/wordml" xmlns:w16sdtdh="http://schemas.microsoft.com/office/word/2020/wordml/sdtdatahash" xmlns:w16se="http://schemas.microsoft.com/office/word/2015/wordml/symex" mc:Ignorable="w14 w15 w16se w16cid w16 w16cex w16sdtdh">
+<w:styles xmlns:mc="http://schemas.openxmlformats.org/markup-compatibility/2006" xmlns:r="http://schemas.openxmlformats.org/officeDocument/2006/relationships" xmlns:w="http://schemas.openxmlformats.org/wordprocessingml/2006/main" xmlns:w14="http://schemas.microsoft.com/office/word/2010/wordml" xmlns:w15="http://schemas.microsoft.com/office/word/2012/wordml" xmlns:w16cex="http://schemas.microsoft.com/office/word/2018/wordml/cex" xmlns:w16cid="http://schemas.microsoft.com/office/word/2016/wordml/cid" xmlns:w16="http://schemas.microsoft.com/office/word/2018/wordml" xmlns:w16du="http://schemas.microsoft.com/office/word/2023/wordml/word16du" xmlns:w16sdtdh="http://schemas.microsoft.com/office/word/2020/wordml/sdtdatahash" xmlns:w16sdtfl="http://schemas.microsoft.com/office/word/2024/wordml/sdtformatlock" xmlns:w16se="http://schemas.microsoft.com/office/word/2015/wordml/symex" mc:Ignorable="w14 w15 w16se w16cid w16 w16cex w16sdtdh w16sdtfl w16du">
   <w:docDefaults>
     <w:rPrDefault>
       <w:rPr>
-        <w:rFonts w:asciiTheme="minorHAnsi" w:hAnsiTheme="minorHAnsi" w:eastAsiaTheme="minorEastAsia" w:cstheme="minorBidi"/>
+        <w:rFonts w:asciiTheme="minorHAnsi" w:eastAsiaTheme="minorEastAsia" w:hAnsiTheme="minorHAnsi" w:cstheme="minorBidi"/>
         <w:sz w:val="22"/>
         <w:szCs w:val="22"/>
         <w:lang w:val="en-AU" w:eastAsia="zh-CN" w:bidi="ar-SA"/>
@@ -3095,14 +3057,14 @@
   <w:latentStyles w:defLockedState="0" w:defUIPriority="99" w:defSemiHidden="0" w:defUnhideWhenUsed="0" w:defQFormat="0" w:count="376">
     <w:lsdException w:name="Normal" w:uiPriority="0" w:qFormat="1"/>
     <w:lsdException w:name="heading 1" w:qFormat="1"/>
-    <w:lsdException w:name="heading 2" w:uiPriority="9" w:semiHidden="1" w:unhideWhenUsed="1" w:qFormat="1"/>
-    <w:lsdException w:name="heading 3" w:uiPriority="9" w:semiHidden="1" w:unhideWhenUsed="1" w:qFormat="1"/>
-    <w:lsdException w:name="heading 4" w:uiPriority="9" w:semiHidden="1" w:unhideWhenUsed="1" w:qFormat="1"/>
-    <w:lsdException w:name="heading 5" w:uiPriority="9" w:semiHidden="1" w:unhideWhenUsed="1" w:qFormat="1"/>
-    <w:lsdException w:name="heading 6" w:uiPriority="9" w:semiHidden="1" w:unhideWhenUsed="1" w:qFormat="1"/>
-    <w:lsdException w:name="heading 7" w:uiPriority="9" w:semiHidden="1" w:unhideWhenUsed="1" w:qFormat="1"/>
-    <w:lsdException w:name="heading 8" w:uiPriority="9" w:semiHidden="1" w:unhideWhenUsed="1" w:qFormat="1"/>
-    <w:lsdException w:name="heading 9" w:uiPriority="9" w:semiHidden="1" w:unhideWhenUsed="1" w:qFormat="1"/>
+    <w:lsdException w:name="heading 2" w:semiHidden="1" w:uiPriority="9" w:unhideWhenUsed="1" w:qFormat="1"/>
+    <w:lsdException w:name="heading 3" w:semiHidden="1" w:uiPriority="9" w:unhideWhenUsed="1" w:qFormat="1"/>
+    <w:lsdException w:name="heading 4" w:semiHidden="1" w:uiPriority="9" w:unhideWhenUsed="1" w:qFormat="1"/>
+    <w:lsdException w:name="heading 5" w:semiHidden="1" w:uiPriority="9" w:unhideWhenUsed="1" w:qFormat="1"/>
+    <w:lsdException w:name="heading 6" w:semiHidden="1" w:uiPriority="9" w:unhideWhenUsed="1" w:qFormat="1"/>
+    <w:lsdException w:name="heading 7" w:semiHidden="1" w:uiPriority="9" w:unhideWhenUsed="1" w:qFormat="1"/>
+    <w:lsdException w:name="heading 8" w:semiHidden="1" w:uiPriority="9" w:unhideWhenUsed="1" w:qFormat="1"/>
+    <w:lsdException w:name="heading 9" w:semiHidden="1" w:uiPriority="9" w:unhideWhenUsed="1" w:qFormat="1"/>
     <w:lsdException w:name="index 1" w:semiHidden="1" w:unhideWhenUsed="1"/>
     <w:lsdException w:name="index 2" w:semiHidden="1" w:unhideWhenUsed="1"/>
     <w:lsdException w:name="index 3" w:semiHidden="1" w:unhideWhenUsed="1"/>
@@ -3112,22 +3074,22 @@
     <w:lsdException w:name="index 7" w:semiHidden="1" w:unhideWhenUsed="1"/>
     <w:lsdException w:name="index 8" w:semiHidden="1" w:unhideWhenUsed="1"/>
     <w:lsdException w:name="index 9" w:semiHidden="1" w:unhideWhenUsed="1"/>
-    <w:lsdException w:name="toc 1" w:uiPriority="39" w:semiHidden="1" w:unhideWhenUsed="1"/>
-    <w:lsdException w:name="toc 2" w:uiPriority="39" w:semiHidden="1" w:unhideWhenUsed="1"/>
-    <w:lsdException w:name="toc 3" w:uiPriority="39" w:semiHidden="1" w:unhideWhenUsed="1"/>
-    <w:lsdException w:name="toc 4" w:uiPriority="39" w:semiHidden="1" w:unhideWhenUsed="1"/>
-    <w:lsdException w:name="toc 5" w:uiPriority="39" w:semiHidden="1" w:unhideWhenUsed="1"/>
-    <w:lsdException w:name="toc 6" w:uiPriority="39" w:semiHidden="1" w:unhideWhenUsed="1"/>
-    <w:lsdException w:name="toc 7" w:uiPriority="39" w:semiHidden="1" w:unhideWhenUsed="1"/>
-    <w:lsdException w:name="toc 8" w:uiPriority="39" w:semiHidden="1" w:unhideWhenUsed="1"/>
-    <w:lsdException w:name="toc 9" w:uiPriority="39" w:semiHidden="1" w:unhideWhenUsed="1"/>
+    <w:lsdException w:name="toc 1" w:semiHidden="1" w:uiPriority="39" w:unhideWhenUsed="1"/>
+    <w:lsdException w:name="toc 2" w:semiHidden="1" w:uiPriority="39" w:unhideWhenUsed="1"/>
+    <w:lsdException w:name="toc 3" w:semiHidden="1" w:uiPriority="39" w:unhideWhenUsed="1"/>
+    <w:lsdException w:name="toc 4" w:semiHidden="1" w:uiPriority="39" w:unhideWhenUsed="1"/>
+    <w:lsdException w:name="toc 5" w:semiHidden="1" w:uiPriority="39" w:unhideWhenUsed="1"/>
+    <w:lsdException w:name="toc 6" w:semiHidden="1" w:uiPriority="39" w:unhideWhenUsed="1"/>
+    <w:lsdException w:name="toc 7" w:semiHidden="1" w:uiPriority="39" w:unhideWhenUsed="1"/>
+    <w:lsdException w:name="toc 8" w:semiHidden="1" w:uiPriority="39" w:unhideWhenUsed="1"/>
+    <w:lsdException w:name="toc 9" w:semiHidden="1" w:uiPriority="39" w:unhideWhenUsed="1"/>
     <w:lsdException w:name="Normal Indent" w:semiHidden="1" w:unhideWhenUsed="1"/>
     <w:lsdException w:name="footnote text" w:semiHidden="1" w:unhideWhenUsed="1"/>
     <w:lsdException w:name="annotation text" w:semiHidden="1" w:unhideWhenUsed="1"/>
     <w:lsdException w:name="header" w:semiHidden="1" w:unhideWhenUsed="1"/>
     <w:lsdException w:name="footer" w:semiHidden="1" w:unhideWhenUsed="1"/>
     <w:lsdException w:name="index heading" w:semiHidden="1" w:unhideWhenUsed="1"/>
-    <w:lsdException w:name="caption" w:uiPriority="35" w:semiHidden="1" w:unhideWhenUsed="1" w:qFormat="1"/>
+    <w:lsdException w:name="caption" w:semiHidden="1" w:uiPriority="35" w:unhideWhenUsed="1" w:qFormat="1"/>
     <w:lsdException w:name="table of figures" w:semiHidden="1" w:unhideWhenUsed="1"/>
     <w:lsdException w:name="envelope address" w:semiHidden="1" w:unhideWhenUsed="1"/>
     <w:lsdException w:name="envelope return" w:semiHidden="1" w:unhideWhenUsed="1"/>
@@ -3158,7 +3120,7 @@
     <w:lsdException w:name="Title" w:uiPriority="10" w:qFormat="1"/>
     <w:lsdException w:name="Closing" w:semiHidden="1" w:unhideWhenUsed="1"/>
     <w:lsdException w:name="Signature" w:semiHidden="1" w:unhideWhenUsed="1"/>
-    <w:lsdException w:name="Default Paragraph Font" w:uiPriority="1" w:semiHidden="1" w:unhideWhenUsed="1"/>
+    <w:lsdException w:name="Default Paragraph Font" w:semiHidden="1" w:uiPriority="1" w:unhideWhenUsed="1"/>
     <w:lsdException w:name="Body Text" w:semiHidden="1" w:unhideWhenUsed="1"/>
     <w:lsdException w:name="Body Text Indent" w:semiHidden="1" w:unhideWhenUsed="1"/>
     <w:lsdException w:name="List Continue" w:semiHidden="1" w:unhideWhenUsed="1"/>
@@ -3358,8 +3320,8 @@
     <w:lsdException w:name="Subtle Reference" w:uiPriority="31" w:qFormat="1"/>
     <w:lsdException w:name="Intense Reference" w:uiPriority="32" w:qFormat="1"/>
     <w:lsdException w:name="Book Title" w:uiPriority="33" w:qFormat="1"/>
-    <w:lsdException w:name="Bibliography" w:uiPriority="37" w:semiHidden="1" w:unhideWhenUsed="1"/>
-    <w:lsdException w:name="TOC Heading" w:uiPriority="39" w:semiHidden="1" w:unhideWhenUsed="1" w:qFormat="1"/>
+    <w:lsdException w:name="Bibliography" w:semiHidden="1" w:uiPriority="37" w:unhideWhenUsed="1"/>
+    <w:lsdException w:name="TOC Heading" w:semiHidden="1" w:uiPriority="39" w:unhideWhenUsed="1" w:qFormat="1"/>
     <w:lsdException w:name="Plain Table 1" w:uiPriority="41"/>
     <w:lsdException w:name="Plain Table 2" w:uiPriority="42"/>
     <w:lsdException w:name="Plain Table 3" w:uiPriority="43"/>
@@ -3470,14 +3432,14 @@
     <w:lsdException w:name="Unresolved Mention" w:semiHidden="1" w:unhideWhenUsed="1"/>
     <w:lsdException w:name="Smart Link" w:semiHidden="1" w:unhideWhenUsed="1"/>
   </w:latentStyles>
-  <w:style w:type="paragraph" w:styleId="Normal" w:default="1">
+  <w:style w:type="paragraph" w:default="1" w:styleId="Normal">
     <w:name w:val="Normal"/>
     <w:rsid w:val="00D84EB3"/>
     <w:pPr>
       <w:spacing w:after="0" w:line="260" w:lineRule="atLeast"/>
     </w:pPr>
     <w:rPr>
-      <w:rFonts w:ascii="Arial" w:hAnsi="Arial" w:eastAsia="SimSun" w:cs="Times New Roman"/>
+      <w:rFonts w:ascii="Arial" w:eastAsia="SimSun" w:hAnsi="Arial" w:cs="Times New Roman"/>
       <w:sz w:val="21"/>
     </w:rPr>
   </w:style>
@@ -3502,13 +3464,13 @@
       <w:lang w:eastAsia="en-US"/>
     </w:rPr>
   </w:style>
-  <w:style w:type="character" w:styleId="DefaultParagraphFont" w:default="1">
+  <w:style w:type="character" w:default="1" w:styleId="DefaultParagraphFont">
     <w:name w:val="Default Paragraph Font"/>
     <w:uiPriority w:val="1"/>
     <w:semiHidden/>
     <w:unhideWhenUsed/>
   </w:style>
-  <w:style w:type="table" w:styleId="TableNormal" w:default="1">
+  <w:style w:type="table" w:default="1" w:styleId="TableNormal">
     <w:name w:val="Normal Table"/>
     <w:uiPriority w:val="99"/>
     <w:semiHidden/>
@@ -3523,20 +3485,20 @@
       </w:tblCellMar>
     </w:tblPr>
   </w:style>
-  <w:style w:type="numbering" w:styleId="NoList" w:default="1">
+  <w:style w:type="numbering" w:default="1" w:styleId="NoList">
     <w:name w:val="No List"/>
     <w:uiPriority w:val="99"/>
     <w:semiHidden/>
     <w:unhideWhenUsed/>
   </w:style>
-  <w:style w:type="character" w:styleId="Heading1Char" w:customStyle="1">
+  <w:style w:type="character" w:customStyle="1" w:styleId="Heading1Char">
     <w:name w:val="Heading 1 Char"/>
     <w:basedOn w:val="DefaultParagraphFont"/>
     <w:link w:val="Heading1"/>
     <w:uiPriority w:val="99"/>
     <w:rsid w:val="00D84EB3"/>
     <w:rPr>
-      <w:rFonts w:ascii="Arial" w:hAnsi="Arial" w:eastAsia="SimSun" w:cs="Times New Roman"/>
+      <w:rFonts w:ascii="Arial" w:eastAsia="SimSun" w:hAnsi="Arial" w:cs="Times New Roman"/>
       <w:b/>
       <w:bCs/>
       <w:color w:val="000000" w:themeColor="text1"/>
@@ -3551,22 +3513,22 @@
     <w:uiPriority w:val="39"/>
     <w:rsid w:val="00D84EB3"/>
     <w:rPr>
-      <w:rFonts w:ascii="Arial" w:hAnsi="Arial" w:eastAsia="SimSun" w:cs="Times New Roman"/>
+      <w:rFonts w:ascii="Arial" w:eastAsia="SimSun" w:hAnsi="Arial" w:cs="Times New Roman"/>
       <w:sz w:val="18"/>
       <w:szCs w:val="24"/>
     </w:rPr>
     <w:tblPr>
       <w:tblBorders>
-        <w:top w:val="single" w:color="BFBFBF" w:themeColor="background1" w:themeShade="BF" w:sz="8" w:space="0"/>
-        <w:left w:val="single" w:color="BFBFBF" w:themeColor="background1" w:themeShade="BF" w:sz="8" w:space="0"/>
-        <w:bottom w:val="single" w:color="BFBFBF" w:themeColor="background1" w:themeShade="BF" w:sz="8" w:space="0"/>
-        <w:right w:val="single" w:color="BFBFBF" w:themeColor="background1" w:themeShade="BF" w:sz="8" w:space="0"/>
-        <w:insideH w:val="single" w:color="BFBFBF" w:themeColor="background1" w:themeShade="BF" w:sz="8" w:space="0"/>
-        <w:insideV w:val="single" w:color="BFBFBF" w:themeColor="background1" w:themeShade="BF" w:sz="8" w:space="0"/>
+        <w:top w:val="single" w:sz="8" w:space="0" w:color="BFBFBF" w:themeColor="background1" w:themeShade="BF"/>
+        <w:left w:val="single" w:sz="8" w:space="0" w:color="BFBFBF" w:themeColor="background1" w:themeShade="BF"/>
+        <w:bottom w:val="single" w:sz="8" w:space="0" w:color="BFBFBF" w:themeColor="background1" w:themeShade="BF"/>
+        <w:right w:val="single" w:sz="8" w:space="0" w:color="BFBFBF" w:themeColor="background1" w:themeShade="BF"/>
+        <w:insideH w:val="single" w:sz="8" w:space="0" w:color="BFBFBF" w:themeColor="background1" w:themeShade="BF"/>
+        <w:insideV w:val="single" w:sz="8" w:space="0" w:color="BFBFBF" w:themeColor="background1" w:themeShade="BF"/>
       </w:tblBorders>
     </w:tblPr>
   </w:style>
-  <w:style w:type="paragraph" w:styleId="Footer-Qld-DoE" w:customStyle="1">
+  <w:style w:type="paragraph" w:customStyle="1" w:styleId="Footer-Qld-DoE">
     <w:name w:val="Footer - Qld-DoE"/>
     <w:link w:val="Footer-Qld-DoEChar"/>
     <w:qFormat/>
@@ -3580,35 +3542,35 @@
       <w:jc w:val="center"/>
     </w:pPr>
     <w:rPr>
-      <w:rFonts w:ascii="Arial" w:hAnsi="Arial" w:eastAsia="SimHei" w:cs="Arial"/>
+      <w:rFonts w:ascii="Arial" w:eastAsia="SimHei" w:hAnsi="Arial" w:cs="Arial"/>
       <w:sz w:val="16"/>
       <w:szCs w:val="16"/>
     </w:rPr>
   </w:style>
-  <w:style w:type="character" w:styleId="Footer-Qld-DoEChar" w:customStyle="1">
+  <w:style w:type="character" w:customStyle="1" w:styleId="Footer-Qld-DoEChar">
     <w:name w:val="Footer - Qld-DoE Char"/>
     <w:basedOn w:val="DefaultParagraphFont"/>
     <w:link w:val="Footer-Qld-DoE"/>
     <w:rsid w:val="00D84EB3"/>
     <w:rPr>
-      <w:rFonts w:ascii="Arial" w:hAnsi="Arial" w:eastAsia="SimHei" w:cs="Arial"/>
+      <w:rFonts w:ascii="Arial" w:eastAsia="SimHei" w:hAnsi="Arial" w:cs="Arial"/>
       <w:sz w:val="16"/>
       <w:szCs w:val="16"/>
     </w:rPr>
   </w:style>
-  <w:style w:type="paragraph" w:styleId="FooterDocumentname" w:customStyle="1">
+  <w:style w:type="paragraph" w:customStyle="1" w:styleId="FooterDocumentname">
     <w:name w:val="Footer Document name"/>
     <w:rsid w:val="00D84EB3"/>
     <w:pPr>
       <w:spacing w:after="0" w:line="240" w:lineRule="auto"/>
     </w:pPr>
     <w:rPr>
-      <w:rFonts w:ascii="Arial" w:hAnsi="Arial" w:eastAsia="SimSun" w:cs="Times New Roman"/>
+      <w:rFonts w:ascii="Arial" w:eastAsia="SimSun" w:hAnsi="Arial" w:cs="Times New Roman"/>
       <w:color w:val="808080"/>
       <w:sz w:val="14"/>
     </w:rPr>
   </w:style>
-  <w:style w:type="paragraph" w:styleId="Footer-Pagenumber" w:customStyle="1">
+  <w:style w:type="paragraph" w:customStyle="1" w:styleId="Footer-Pagenumber">
     <w:name w:val="Footer - Page number"/>
     <w:rsid w:val="00D84EB3"/>
     <w:pPr>
@@ -3616,11 +3578,11 @@
       <w:ind w:left="-454" w:right="-510"/>
     </w:pPr>
     <w:rPr>
-      <w:rFonts w:ascii="Arial" w:hAnsi="Arial" w:eastAsia="SimSun" w:cs="Times New Roman"/>
+      <w:rFonts w:ascii="Arial" w:eastAsia="SimSun" w:hAnsi="Arial" w:cs="Times New Roman"/>
       <w:sz w:val="14"/>
     </w:rPr>
   </w:style>
-  <w:style w:type="paragraph" w:styleId="TableHeading1WHITE" w:customStyle="1">
+  <w:style w:type="paragraph" w:customStyle="1" w:styleId="TableHeading1WHITE">
     <w:name w:val="Table Heading 1 WHITE"/>
     <w:next w:val="Normal"/>
     <w:rsid w:val="00D84EB3"/>
@@ -3628,7 +3590,7 @@
       <w:spacing w:after="0" w:line="240" w:lineRule="auto"/>
     </w:pPr>
     <w:rPr>
-      <w:rFonts w:ascii="Arial" w:hAnsi="Arial" w:eastAsia="Arial Unicode MS" w:cs="Arial"/>
+      <w:rFonts w:ascii="Arial" w:eastAsia="Arial Unicode MS" w:hAnsi="Arial" w:cs="Arial"/>
       <w:b/>
       <w:color w:val="FFFFFF" w:themeColor="background1"/>
       <w:sz w:val="24"/>
@@ -3636,7 +3598,7 @@
       <w:lang w:eastAsia="en-AU"/>
     </w:rPr>
   </w:style>
-  <w:style w:type="paragraph" w:styleId="Body6-6space" w:customStyle="1">
+  <w:style w:type="paragraph" w:customStyle="1" w:styleId="Body6-6space">
     <w:name w:val="Body 6-6 space"/>
     <w:basedOn w:val="Normal"/>
     <w:rsid w:val="00D84EB3"/>
@@ -3647,7 +3609,7 @@
       <w:szCs w:val="21"/>
     </w:rPr>
   </w:style>
-  <w:style w:type="character" w:styleId="Bold" w:customStyle="1">
+  <w:style w:type="character" w:customStyle="1" w:styleId="Bold">
     <w:name w:val="Bold"/>
     <w:basedOn w:val="DefaultParagraphFont"/>
     <w:uiPriority w:val="1"/>
@@ -3657,20 +3619,20 @@
       <w:bCs/>
     </w:rPr>
   </w:style>
-  <w:style w:type="paragraph" w:styleId="Table-9ptBody0-6space" w:customStyle="1">
+  <w:style w:type="paragraph" w:customStyle="1" w:styleId="Table-9ptBody0-6space">
     <w:name w:val="Table-9pt Body 0-6 space"/>
     <w:rsid w:val="00D84EB3"/>
     <w:pPr>
       <w:spacing w:after="120" w:line="240" w:lineRule="atLeast"/>
     </w:pPr>
     <w:rPr>
-      <w:rFonts w:ascii="Arial" w:hAnsi="Arial" w:eastAsia="SimSun" w:cs="Times New Roman"/>
+      <w:rFonts w:ascii="Arial" w:eastAsia="SimSun" w:hAnsi="Arial" w:cs="Times New Roman"/>
       <w:bCs/>
       <w:sz w:val="18"/>
       <w:szCs w:val="18"/>
     </w:rPr>
   </w:style>
-  <w:style w:type="paragraph" w:styleId="Numbers" w:customStyle="1">
+  <w:style w:type="paragraph" w:customStyle="1" w:styleId="Numbers">
     <w:name w:val="Numbers"/>
     <w:rsid w:val="00D84EB3"/>
     <w:pPr>
@@ -3684,14 +3646,14 @@
       <w:ind w:left="284" w:hanging="284"/>
     </w:pPr>
     <w:rPr>
-      <w:rFonts w:ascii="Arial" w:hAnsi="Arial" w:eastAsia="Arial Unicode MS" w:cs="Times New Roman"/>
+      <w:rFonts w:ascii="Arial" w:eastAsia="Arial Unicode MS" w:hAnsi="Arial" w:cs="Times New Roman"/>
       <w:color w:val="000000" w:themeColor="text1"/>
       <w:sz w:val="21"/>
       <w:szCs w:val="21"/>
       <w:lang w:eastAsia="en-AU"/>
     </w:rPr>
   </w:style>
-  <w:style w:type="paragraph" w:styleId="BodyOpeningParagraph12-6pt" w:customStyle="1">
+  <w:style w:type="paragraph" w:customStyle="1" w:styleId="BodyOpeningParagraph12-6pt">
     <w:name w:val="Body Opening Paragraph 12-6 pt"/>
     <w:basedOn w:val="Body6-6space"/>
     <w:next w:val="Body6-6space"/>
@@ -3700,7 +3662,7 @@
       <w:spacing w:before="240"/>
     </w:pPr>
   </w:style>
-  <w:style w:type="paragraph" w:styleId="Heading1RightAligned" w:customStyle="1">
+  <w:style w:type="paragraph" w:customStyle="1" w:styleId="Heading1RightAligned">
     <w:name w:val="Heading 1 RightAligned"/>
     <w:basedOn w:val="Normal"/>
     <w:rsid w:val="00D84EB3"/>
@@ -3717,7 +3679,7 @@
       <w:lang w:eastAsia="en-US"/>
     </w:rPr>
   </w:style>
-  <w:style w:type="character" w:styleId="ACARASUN-Header" w:customStyle="1">
+  <w:style w:type="character" w:customStyle="1" w:styleId="ACARASUN-Header">
     <w:name w:val="_ACARASUN-Header"/>
     <w:basedOn w:val="DefaultParagraphFont"/>
     <w:uiPriority w:val="1"/>
@@ -3730,7 +3692,7 @@
       <w:vertAlign w:val="superscript"/>
     </w:rPr>
   </w:style>
-  <w:style w:type="paragraph" w:styleId="Footnote" w:customStyle="1">
+  <w:style w:type="paragraph" w:customStyle="1" w:styleId="Footnote">
     <w:name w:val="Footnote"/>
     <w:basedOn w:val="Normal"/>
     <w:rsid w:val="00D84EB3"/>
@@ -3743,7 +3705,7 @@
       <w:sz w:val="11"/>
     </w:rPr>
   </w:style>
-  <w:style w:type="character" w:styleId="Grey" w:customStyle="1">
+  <w:style w:type="character" w:customStyle="1" w:styleId="Grey">
     <w:name w:val="Grey"/>
     <w:basedOn w:val="DefaultParagraphFont"/>
     <w:uiPriority w:val="1"/>
@@ -3752,7 +3714,7 @@
       <w:color w:val="385623" w:themeColor="accent6" w:themeShade="80"/>
     </w:rPr>
   </w:style>
-  <w:style w:type="paragraph" w:styleId="BodyHeadingBold" w:customStyle="1">
+  <w:style w:type="paragraph" w:customStyle="1" w:styleId="BodyHeadingBold">
     <w:name w:val="Body Heading Bold"/>
     <w:basedOn w:val="Body6-6space"/>
     <w:next w:val="Body6-6space"/>
@@ -3765,7 +3727,7 @@
       <w:b/>
     </w:rPr>
   </w:style>
-  <w:style w:type="paragraph" w:styleId="Bullet6-6space" w:customStyle="1">
+  <w:style w:type="paragraph" w:customStyle="1" w:styleId="Bullet6-6space">
     <w:name w:val="Bullet 6-6 space"/>
     <w:rsid w:val="00D84EB3"/>
     <w:pPr>
@@ -3776,12 +3738,12 @@
       <w:ind w:left="284" w:hanging="284"/>
     </w:pPr>
     <w:rPr>
-      <w:rFonts w:ascii="Arial" w:hAnsi="Arial" w:eastAsia="SimSun" w:cs="Arial"/>
+      <w:rFonts w:ascii="Arial" w:eastAsia="SimSun" w:hAnsi="Arial" w:cs="Arial"/>
       <w:sz w:val="21"/>
       <w:szCs w:val="24"/>
     </w:rPr>
   </w:style>
-  <w:style w:type="character" w:styleId="Boldwhite" w:customStyle="1">
+  <w:style w:type="character" w:customStyle="1" w:styleId="Boldwhite">
     <w:name w:val="Bold white"/>
     <w:basedOn w:val="DefaultParagraphFont"/>
     <w:uiPriority w:val="1"/>
@@ -3792,7 +3754,7 @@
       <w:color w:val="FFFFFF" w:themeColor="background1"/>
     </w:rPr>
   </w:style>
-  <w:style w:type="paragraph" w:styleId="Table-10ptHeaderWhite" w:customStyle="1">
+  <w:style w:type="paragraph" w:customStyle="1" w:styleId="Table-10ptHeaderWhite">
     <w:name w:val="Table-10pt Header White"/>
     <w:rsid w:val="00D84EB3"/>
     <w:pPr>
@@ -3800,7 +3762,7 @@
       <w:jc w:val="center"/>
     </w:pPr>
     <w:rPr>
-      <w:rFonts w:ascii="Arial" w:hAnsi="Arial" w:eastAsia="SimSun" w:cs="Times New Roman"/>
+      <w:rFonts w:ascii="Arial" w:eastAsia="SimSun" w:hAnsi="Arial" w:cs="Times New Roman"/>
       <w:b/>
       <w:bCs/>
       <w:color w:val="FFFFFF" w:themeColor="background1"/>
@@ -3808,7 +3770,7 @@
       <w:szCs w:val="18"/>
     </w:rPr>
   </w:style>
-  <w:style w:type="paragraph" w:styleId="AssessmentHeading12ptBlack" w:customStyle="1">
+  <w:style w:type="paragraph" w:customStyle="1" w:styleId="AssessmentHeading12ptBlack">
     <w:name w:val="Assessment Heading 12pt Black"/>
     <w:basedOn w:val="Normal"/>
     <w:rsid w:val="00D84EB3"/>
@@ -3824,16 +3786,16 @@
       <w:lang w:eastAsia="en-AU"/>
     </w:rPr>
   </w:style>
-  <w:style w:type="paragraph" w:styleId="Heading2-EnglishLightBanner" w:customStyle="1">
+  <w:style w:type="paragraph" w:customStyle="1" w:styleId="Heading2-EnglishLightBanner">
     <w:name w:val="Heading 2 - English LightBanner"/>
     <w:basedOn w:val="Normal"/>
     <w:rsid w:val="00D84EB3"/>
     <w:pPr>
       <w:pBdr>
-        <w:top w:val="single" w:color="CAE3EE" w:sz="18" w:space="1"/>
-        <w:left w:val="single" w:color="CAE3EE" w:sz="18" w:space="4"/>
-        <w:bottom w:val="single" w:color="CAE3EE" w:sz="18" w:space="1"/>
-        <w:right w:val="single" w:color="CAE3EE" w:sz="18" w:space="4"/>
+        <w:top w:val="single" w:sz="18" w:space="1" w:color="CAE3EE"/>
+        <w:left w:val="single" w:sz="18" w:space="4" w:color="CAE3EE"/>
+        <w:bottom w:val="single" w:sz="18" w:space="1" w:color="CAE3EE"/>
+        <w:right w:val="single" w:sz="18" w:space="4" w:color="CAE3EE"/>
       </w:pBdr>
       <w:shd w:val="clear" w:color="auto" w:fill="CAE3EE"/>
       <w:spacing w:before="240" w:after="200"/>
@@ -3844,7 +3806,7 @@
       <w:szCs w:val="21"/>
     </w:rPr>
   </w:style>
-  <w:style w:type="paragraph" w:styleId="Table-9ptBody0-0space" w:customStyle="1">
+  <w:style w:type="paragraph" w:customStyle="1" w:styleId="Table-9ptBody0-0space">
     <w:name w:val="Table-9pt Body 0-0 space"/>
     <w:basedOn w:val="Table-9ptBody0-6space"/>
     <w:rsid w:val="00D84EB3"/>
@@ -3852,7 +3814,7 @@
       <w:spacing w:after="0"/>
     </w:pPr>
   </w:style>
-  <w:style w:type="paragraph" w:styleId="Table-9ptheaderblackleft" w:customStyle="1">
+  <w:style w:type="paragraph" w:customStyle="1" w:styleId="Table-9ptheaderblackleft">
     <w:name w:val="Table-9pt header black left"/>
     <w:basedOn w:val="Normal"/>
     <w:rsid w:val="00D84EB3"/>
@@ -3867,7 +3829,7 @@
       <w:szCs w:val="18"/>
     </w:rPr>
   </w:style>
-  <w:style w:type="paragraph" w:styleId="Body0-0space" w:customStyle="1">
+  <w:style w:type="paragraph" w:customStyle="1" w:styleId="Body0-0space">
     <w:name w:val="Body 0-0 space"/>
     <w:basedOn w:val="Body6-6space"/>
     <w:rsid w:val="00D84EB3"/>
@@ -3875,7 +3837,7 @@
       <w:spacing w:before="0" w:after="0"/>
     </w:pPr>
   </w:style>
-  <w:style w:type="paragraph" w:styleId="Bullet6-6spaceindent5" w:customStyle="1">
+  <w:style w:type="paragraph" w:customStyle="1" w:styleId="Bullet6-6spaceindent5">
     <w:name w:val="Bullet 6-6 space indent .5"/>
     <w:basedOn w:val="Bullet6-6space"/>
     <w:rsid w:val="00D84EB3"/>
@@ -3893,12 +3855,12 @@
     </w:pPr>
     <w:tblPr>
       <w:tblBorders>
-        <w:top w:val="single" w:color="BFBFBF" w:themeColor="background1" w:themeShade="BF" w:sz="4" w:space="0"/>
-        <w:left w:val="single" w:color="BFBFBF" w:themeColor="background1" w:themeShade="BF" w:sz="4" w:space="0"/>
-        <w:bottom w:val="single" w:color="BFBFBF" w:themeColor="background1" w:themeShade="BF" w:sz="4" w:space="0"/>
-        <w:right w:val="single" w:color="BFBFBF" w:themeColor="background1" w:themeShade="BF" w:sz="4" w:space="0"/>
-        <w:insideH w:val="single" w:color="BFBFBF" w:themeColor="background1" w:themeShade="BF" w:sz="4" w:space="0"/>
-        <w:insideV w:val="single" w:color="BFBFBF" w:themeColor="background1" w:themeShade="BF" w:sz="4" w:space="0"/>
+        <w:top w:val="single" w:sz="4" w:space="0" w:color="BFBFBF" w:themeColor="background1" w:themeShade="BF"/>
+        <w:left w:val="single" w:sz="4" w:space="0" w:color="BFBFBF" w:themeColor="background1" w:themeShade="BF"/>
+        <w:bottom w:val="single" w:sz="4" w:space="0" w:color="BFBFBF" w:themeColor="background1" w:themeShade="BF"/>
+        <w:right w:val="single" w:sz="4" w:space="0" w:color="BFBFBF" w:themeColor="background1" w:themeShade="BF"/>
+        <w:insideH w:val="single" w:sz="4" w:space="0" w:color="BFBFBF" w:themeColor="background1" w:themeShade="BF"/>
+        <w:insideV w:val="single" w:sz="4" w:space="0" w:color="BFBFBF" w:themeColor="background1" w:themeShade="BF"/>
       </w:tblBorders>
     </w:tblPr>
   </w:style>
@@ -3917,14 +3879,14 @@
       <w:spacing w:line="240" w:lineRule="auto"/>
     </w:pPr>
   </w:style>
-  <w:style w:type="character" w:styleId="HeaderChar" w:customStyle="1">
+  <w:style w:type="character" w:customStyle="1" w:styleId="HeaderChar">
     <w:name w:val="Header Char"/>
     <w:basedOn w:val="DefaultParagraphFont"/>
     <w:link w:val="Header"/>
     <w:uiPriority w:val="99"/>
     <w:rsid w:val="00D84EB3"/>
     <w:rPr>
-      <w:rFonts w:ascii="Arial" w:hAnsi="Arial" w:eastAsia="SimSun" w:cs="Times New Roman"/>
+      <w:rFonts w:ascii="Arial" w:eastAsia="SimSun" w:hAnsi="Arial" w:cs="Times New Roman"/>
       <w:sz w:val="21"/>
     </w:rPr>
   </w:style>
@@ -3943,14 +3905,14 @@
       <w:spacing w:line="240" w:lineRule="auto"/>
     </w:pPr>
   </w:style>
-  <w:style w:type="character" w:styleId="FooterChar" w:customStyle="1">
+  <w:style w:type="character" w:customStyle="1" w:styleId="FooterChar">
     <w:name w:val="Footer Char"/>
     <w:basedOn w:val="DefaultParagraphFont"/>
     <w:link w:val="Footer"/>
     <w:uiPriority w:val="99"/>
     <w:rsid w:val="00D84EB3"/>
     <w:rPr>
-      <w:rFonts w:ascii="Arial" w:hAnsi="Arial" w:eastAsia="SimSun" w:cs="Times New Roman"/>
+      <w:rFonts w:ascii="Arial" w:eastAsia="SimSun" w:hAnsi="Arial" w:cs="Times New Roman"/>
       <w:sz w:val="21"/>
     </w:rPr>
   </w:style>
@@ -3971,7 +3933,7 @@
       <w:szCs w:val="18"/>
     </w:rPr>
   </w:style>
-  <w:style w:type="character" w:styleId="BalloonTextChar" w:customStyle="1">
+  <w:style w:type="character" w:customStyle="1" w:styleId="BalloonTextChar">
     <w:name w:val="Balloon Text Char"/>
     <w:basedOn w:val="DefaultParagraphFont"/>
     <w:link w:val="BalloonText"/>
@@ -3979,12 +3941,12 @@
     <w:semiHidden/>
     <w:rsid w:val="00E7247D"/>
     <w:rPr>
-      <w:rFonts w:ascii="Lucida Grande" w:hAnsi="Lucida Grande" w:eastAsia="SimSun" w:cs="Lucida Grande"/>
+      <w:rFonts w:ascii="Lucida Grande" w:eastAsia="SimSun" w:hAnsi="Lucida Grande" w:cs="Lucida Grande"/>
       <w:sz w:val="18"/>
       <w:szCs w:val="18"/>
     </w:rPr>
   </w:style>
-  <w:style w:type="paragraph" w:styleId="Bullet3-3space" w:customStyle="1">
+  <w:style w:type="paragraph" w:customStyle="1" w:styleId="Bullet3-3space">
     <w:name w:val="Bullet 3-3 space"/>
     <w:basedOn w:val="Bullet6-6space"/>
     <w:next w:val="Bullet-indented"/>
@@ -4000,7 +3962,7 @@
       <w:szCs w:val="21"/>
     </w:rPr>
   </w:style>
-  <w:style w:type="paragraph" w:styleId="Bullet-indented" w:customStyle="1">
+  <w:style w:type="paragraph" w:customStyle="1" w:styleId="Bullet-indented">
     <w:name w:val="Bullet-indented"/>
     <w:basedOn w:val="Normal"/>
     <w:rsid w:val="00E7247D"/>
@@ -4016,7 +3978,7 @@
       <w:lang w:eastAsia="en-US"/>
     </w:rPr>
   </w:style>
-  <w:style w:type="paragraph" w:styleId="Table-9ptBody0-3space" w:customStyle="1">
+  <w:style w:type="paragraph" w:customStyle="1" w:styleId="Table-9ptBody0-3space">
     <w:name w:val="Table-9pt Body 0-3 space"/>
     <w:basedOn w:val="Normal"/>
     <w:rsid w:val="00E7247D"/>
@@ -4033,7 +3995,7 @@
 </file>
 
 <file path=word/theme/theme1.xml><?xml version="1.0" encoding="utf-8"?>
-<a:theme xmlns:a="http://schemas.openxmlformats.org/drawingml/2006/main" xmlns:thm15="http://schemas.microsoft.com/office/thememl/2012/main" name="Office Theme">
+<a:theme xmlns:a="http://schemas.openxmlformats.org/drawingml/2006/main" name="Office Theme">
   <a:themeElements>
     <a:clrScheme name="Office">
       <a:dk1>
@@ -4328,6 +4290,26 @@
 </file>
 
 <file path=customXml/item1.xml><?xml version="1.0" encoding="utf-8"?>
+<p:properties xmlns:p="http://schemas.microsoft.com/office/2006/metadata/properties" xmlns:xsi="http://www.w3.org/2001/XMLSchema-instance" xmlns:pc="http://schemas.microsoft.com/office/infopath/2007/PartnerControls">
+  <documentManagement>
+    <TaxCatchAll xmlns="1a203dcd-dfdf-4f71-87cf-67faed657809" xsi:nil="true"/>
+    <lcf76f155ced4ddcb4097134ff3c332f xmlns="90e52d58-c549-4481-a274-f574bf9b5a08">
+      <Terms xmlns="http://schemas.microsoft.com/office/infopath/2007/PartnerControls"/>
+    </lcf76f155ced4ddcb4097134ff3c332f>
+  </documentManagement>
+</p:properties>
+</file>
+
+<file path=customXml/item2.xml><?xml version="1.0" encoding="utf-8"?>
+<?mso-contentType ?>
+<FormTemplates xmlns="http://schemas.microsoft.com/sharepoint/v3/contenttype/forms">
+  <Display>DocumentLibraryForm</Display>
+  <Edit>DocumentLibraryForm</Edit>
+  <New>DocumentLibraryForm</New>
+</FormTemplates>
+</file>
+
+<file path=customXml/item3.xml><?xml version="1.0" encoding="utf-8"?>
 <ct:contentTypeSchema xmlns:ct="http://schemas.microsoft.com/office/2006/metadata/contentType" xmlns:ma="http://schemas.microsoft.com/office/2006/metadata/properties/metaAttributes" ct:_="" ma:_="" ma:contentTypeName="Document" ma:contentTypeID="0x010100A4C2B6FECF745F4A9AA64E89FCFBF998" ma:contentTypeVersion="15" ma:contentTypeDescription="Create a new document." ma:contentTypeScope="" ma:versionID="7cb7d70489ba75a81583193e3d654670">
   <xsd:schema xmlns:xsd="http://www.w3.org/2001/XMLSchema" xmlns:xs="http://www.w3.org/2001/XMLSchema" xmlns:p="http://schemas.microsoft.com/office/2006/metadata/properties" xmlns:ns2="90e52d58-c549-4481-a274-f574bf9b5a08" xmlns:ns3="467245c3-60ec-417b-9b35-0c33acff6b5e" xmlns:ns4="1a203dcd-dfdf-4f71-87cf-67faed657809" targetNamespace="http://schemas.microsoft.com/office/2006/metadata/properties" ma:root="true" ma:fieldsID="c955f6274d940cb55e6cb92884309327" ns2:_="" ns3:_="" ns4:_="">
     <xsd:import namespace="90e52d58-c549-4481-a274-f574bf9b5a08"/>
@@ -4567,34 +4549,41 @@
 </ct:contentTypeSchema>
 </file>
 
-<file path=customXml/item2.xml><?xml version="1.0" encoding="utf-8"?>
-<?mso-contentType ?>
-<FormTemplates xmlns="http://schemas.microsoft.com/sharepoint/v3/contenttype/forms">
-  <Display>DocumentLibraryForm</Display>
-  <Edit>DocumentLibraryForm</Edit>
-  <New>DocumentLibraryForm</New>
-</FormTemplates>
-</file>
-
-<file path=customXml/item3.xml><?xml version="1.0" encoding="utf-8"?>
-<p:properties xmlns:p="http://schemas.microsoft.com/office/2006/metadata/properties" xmlns:xsi="http://www.w3.org/2001/XMLSchema-instance" xmlns:pc="http://schemas.microsoft.com/office/infopath/2007/PartnerControls">
-  <documentManagement>
-    <TaxCatchAll xmlns="1a203dcd-dfdf-4f71-87cf-67faed657809" xsi:nil="true"/>
-    <lcf76f155ced4ddcb4097134ff3c332f xmlns="90e52d58-c549-4481-a274-f574bf9b5a08">
-      <Terms xmlns="http://schemas.microsoft.com/office/infopath/2007/PartnerControls"/>
-    </lcf76f155ced4ddcb4097134ff3c332f>
-  </documentManagement>
-</p:properties>
-</file>
-
 <file path=customXml/itemProps1.xml><?xml version="1.0" encoding="utf-8"?>
-<ds:datastoreItem xmlns:ds="http://schemas.openxmlformats.org/officeDocument/2006/customXml" ds:itemID="{F512F56E-173A-41A6-BA59-668892A74E93}"/>
+<ds:datastoreItem xmlns:ds="http://schemas.openxmlformats.org/officeDocument/2006/customXml" ds:itemID="{7DBC5DBD-7557-4490-818B-083E99643D71}">
+  <ds:schemaRefs>
+    <ds:schemaRef ds:uri="http://schemas.microsoft.com/office/2006/metadata/properties"/>
+    <ds:schemaRef ds:uri="http://schemas.microsoft.com/office/infopath/2007/PartnerControls"/>
+    <ds:schemaRef ds:uri="1a203dcd-dfdf-4f71-87cf-67faed657809"/>
+    <ds:schemaRef ds:uri="90e52d58-c549-4481-a274-f574bf9b5a08"/>
+  </ds:schemaRefs>
+</ds:datastoreItem>
 </file>
 
 <file path=customXml/itemProps2.xml><?xml version="1.0" encoding="utf-8"?>
-<ds:datastoreItem xmlns:ds="http://schemas.openxmlformats.org/officeDocument/2006/customXml" ds:itemID="{081652EA-866F-4E58-AB1D-834FCE549A4F}"/>
+<ds:datastoreItem xmlns:ds="http://schemas.openxmlformats.org/officeDocument/2006/customXml" ds:itemID="{081652EA-866F-4E58-AB1D-834FCE549A4F}">
+  <ds:schemaRefs>
+    <ds:schemaRef ds:uri="http://schemas.microsoft.com/sharepoint/v3/contenttype/forms"/>
+  </ds:schemaRefs>
+</ds:datastoreItem>
 </file>
 
 <file path=customXml/itemProps3.xml><?xml version="1.0" encoding="utf-8"?>
-<ds:datastoreItem xmlns:ds="http://schemas.openxmlformats.org/officeDocument/2006/customXml" ds:itemID="{7DBC5DBD-7557-4490-818B-083E99643D71}"/>
+<ds:datastoreItem xmlns:ds="http://schemas.openxmlformats.org/officeDocument/2006/customXml" ds:itemID="{F512F56E-173A-41A6-BA59-668892A74E93}">
+  <ds:schemaRefs>
+    <ds:schemaRef ds:uri="http://schemas.microsoft.com/office/2006/metadata/contentType"/>
+    <ds:schemaRef ds:uri="http://schemas.microsoft.com/office/2006/metadata/properties/metaAttributes"/>
+    <ds:schemaRef ds:uri="http://www.w3.org/2001/XMLSchema"/>
+    <ds:schemaRef ds:uri="http://schemas.microsoft.com/office/2006/metadata/properties"/>
+    <ds:schemaRef ds:uri="90e52d58-c549-4481-a274-f574bf9b5a08"/>
+    <ds:schemaRef ds:uri="467245c3-60ec-417b-9b35-0c33acff6b5e"/>
+    <ds:schemaRef ds:uri="1a203dcd-dfdf-4f71-87cf-67faed657809"/>
+    <ds:schemaRef ds:uri="http://schemas.microsoft.com/office/2006/documentManagement/types"/>
+    <ds:schemaRef ds:uri="http://schemas.microsoft.com/office/infopath/2007/PartnerControls"/>
+    <ds:schemaRef ds:uri="http://schemas.openxmlformats.org/package/2006/metadata/core-properties"/>
+    <ds:schemaRef ds:uri="http://purl.org/dc/elements/1.1/"/>
+    <ds:schemaRef ds:uri="http://purl.org/dc/terms/"/>
+    <ds:schemaRef ds:uri="http://schemas.microsoft.com/internal/obd"/>
+  </ds:schemaRefs>
+</ds:datastoreItem>
 </file>
</xml_diff>